<commit_message>
Redo Test Sheets chapter: white tables and condensed text
</commit_message>
<xml_diff>
--- a/ACDC charger/400A Charger Measurement Plan.docx
+++ b/ACDC charger/400A Charger Measurement Plan.docx
@@ -1977,7 +1977,6 @@
         <w:tc>
           <w:tcPr>
             <w:tcW w:type="dxa" w:w="3024"/>
-            <w:shd w:val="clear" w:color="auto" w:fill="D9E1F2"/>
           </w:tcPr>
           <w:p>
             <w:r>
@@ -2003,7 +2002,6 @@
         <w:tc>
           <w:tcPr>
             <w:tcW w:type="dxa" w:w="3024"/>
-            <w:shd w:val="clear" w:color="auto" w:fill="D9E1F2"/>
           </w:tcPr>
           <w:p>
             <w:r>
@@ -2029,7 +2027,6 @@
         <w:tc>
           <w:tcPr>
             <w:tcW w:type="dxa" w:w="3024"/>
-            <w:shd w:val="clear" w:color="auto" w:fill="D9E1F2"/>
           </w:tcPr>
           <w:p>
             <w:r>
@@ -2055,7 +2052,6 @@
         <w:tc>
           <w:tcPr>
             <w:tcW w:type="dxa" w:w="3024"/>
-            <w:shd w:val="clear" w:color="auto" w:fill="D9E1F2"/>
           </w:tcPr>
           <w:p>
             <w:r>
@@ -2072,46 +2068,15 @@
           </w:tcPr>
           <w:p>
             <w:r>
-              <w:t>Review the project plan document against the must-have list. Perform at desk; no physical equipment required.</w:t>
-              <w:br/>
-              <w:t>1. Open ProjectPlan_400A_Charger.docx.</w:t>
-              <w:br/>
-              <w:t>2. Check that each must-have item in the list below has a corresponding entry in the project plan:</w:t>
-              <w:br/>
-              <w:t>3.   a. Galvanic AC/DC isolation</w:t>
-              <w:br/>
-              <w:t>4.   b. 400/500 A Powerlock (3P+PE)</w:t>
-              <w:br/>
-              <w:t>5.   c. Unidirectional operation</w:t>
-              <w:br/>
-              <w:t>6.   d. Liquid cooling</w:t>
-              <w:br/>
-              <w:t>7.   e. DC voltage range ≥ 600–800 VDC</w:t>
-              <w:br/>
-              <w:t>8.   f. Material cost &lt; €20,000</w:t>
-              <w:br/>
-              <w:t>9.   g. Communication: ModbusTCP / CAN / Profinet / EtherCAT</w:t>
-              <w:br/>
-              <w:t>10.   h. EU compliant</w:t>
-              <w:br/>
-              <w:t>11.   i. Mobile / vibration-resistant</w:t>
-              <w:br/>
-              <w:t>12.   j. Min. settable power ≥ 55 kW / 80 A</w:t>
-              <w:br/>
-              <w:t>13.   k. Inrush acceptable for C-type C80 breaker</w:t>
-              <w:br/>
-              <w:t>14. Tick each item as Present / Missing in the result column.</w:t>
-              <w:br/>
-              <w:t>15. Record any missing items as non-conformances.</w:t>
-            </w:r>
-          </w:p>
-        </w:tc>
-      </w:tr>
-      <w:tr>
-        <w:tc>
-          <w:tcPr>
-            <w:tcW w:type="dxa" w:w="3024"/>
-            <w:shd w:val="clear" w:color="auto" w:fill="D9E1F2"/>
+              <w:t>Review ProjectPlan_400A_Charger.docx against the 11 must-have items (galvanic AC/DC isolation; 400/500 A Powerlock 3P+PE; unidirectional; liquid cooling; DC ≥ 600–800 VDC; material cost &lt; €20,000; ModbusTCP/CAN/Profinet/EtherCAT; EU compliant; mobile/vibration-resistant; min. settable power ≥ 55 kW/80 A; inrush acceptable for a C-type C80 breaker). Tick each Present or Missing and log any missing item as a non-conformance.</w:t>
+            </w:r>
+          </w:p>
+        </w:tc>
+      </w:tr>
+      <w:tr>
+        <w:tc>
+          <w:tcPr>
+            <w:tcW w:type="dxa" w:w="3024"/>
           </w:tcPr>
           <w:p>
             <w:r>
@@ -2139,7 +2104,6 @@
         <w:tc>
           <w:tcPr>
             <w:tcW w:type="dxa" w:w="3024"/>
-            <w:shd w:val="clear" w:color="auto" w:fill="D9E1F2"/>
           </w:tcPr>
           <w:p>
             <w:r>
@@ -2165,7 +2129,6 @@
         <w:tc>
           <w:tcPr>
             <w:tcW w:type="dxa" w:w="3024"/>
-            <w:shd w:val="clear" w:color="auto" w:fill="D9E1F2"/>
           </w:tcPr>
           <w:p>
             <w:r>
@@ -2191,7 +2154,6 @@
         <w:tc>
           <w:tcPr>
             <w:tcW w:type="dxa" w:w="3024"/>
-            <w:shd w:val="clear" w:color="auto" w:fill="D9E1F2"/>
           </w:tcPr>
           <w:p>
             <w:r>
@@ -2215,7 +2177,6 @@
         <w:tc>
           <w:tcPr>
             <w:tcW w:type="dxa" w:w="3024"/>
-            <w:shd w:val="clear" w:color="auto" w:fill="D9E1F2"/>
           </w:tcPr>
           <w:p>
             <w:r>
@@ -2259,7 +2220,6 @@
         <w:tc>
           <w:tcPr>
             <w:tcW w:type="dxa" w:w="3024"/>
-            <w:shd w:val="clear" w:color="auto" w:fill="D9E1F2"/>
           </w:tcPr>
           <w:p>
             <w:r>
@@ -2285,7 +2245,6 @@
         <w:tc>
           <w:tcPr>
             <w:tcW w:type="dxa" w:w="3024"/>
-            <w:shd w:val="clear" w:color="auto" w:fill="D9E1F2"/>
           </w:tcPr>
           <w:p>
             <w:r>
@@ -2311,7 +2270,6 @@
         <w:tc>
           <w:tcPr>
             <w:tcW w:type="dxa" w:w="3024"/>
-            <w:shd w:val="clear" w:color="auto" w:fill="D9E1F2"/>
           </w:tcPr>
           <w:p>
             <w:r>
@@ -2337,7 +2295,6 @@
         <w:tc>
           <w:tcPr>
             <w:tcW w:type="dxa" w:w="3024"/>
-            <w:shd w:val="clear" w:color="auto" w:fill="D9E1F2"/>
           </w:tcPr>
           <w:p>
             <w:r>
@@ -2354,36 +2311,15 @@
           </w:tcPr>
           <w:p>
             <w:r>
-              <w:t>Collect datasheets and certificate documents for all candidate modules. Use the SCORE spreadsheet to rate each supplier.</w:t>
-              <w:br/>
-              <w:t>1. List all candidate modules identified in the market survey.</w:t>
-              <w:br/>
-              <w:t>2. For each module, check the availability of:</w:t>
-              <w:br/>
-              <w:t>3.   a. Complete datasheet (power, voltage range, efficiency, dimensions, weight)</w:t>
-              <w:br/>
-              <w:t>4.   b. CE / TUV certificate or declaration of conformity</w:t>
-              <w:br/>
-              <w:t>5.   c. Communication protocol documentation (register map / CAN DBC)</w:t>
-              <w:br/>
-              <w:t>6.   d. Mechanical drawing or 3D model</w:t>
-              <w:br/>
-              <w:t>7.   e. Cooling specifications (flow rate, pressure drop, inlet temperature)</w:t>
-              <w:br/>
-              <w:t>8. Score each criterion 0 (missing) / 5 (partial) / 10 (complete).</w:t>
-              <w:br/>
-              <w:t>9. Calculate overall documentation score per candidate.</w:t>
-              <w:br/>
-              <w:t>10. Record results in SCORE matrix.</w:t>
-            </w:r>
-          </w:p>
-        </w:tc>
-      </w:tr>
-      <w:tr>
-        <w:tc>
-          <w:tcPr>
-            <w:tcW w:type="dxa" w:w="3024"/>
-            <w:shd w:val="clear" w:color="auto" w:fill="D9E1F2"/>
+              <w:t>For each candidate module, use the SCORE spreadsheet to score 0/5/10 the availability of: complete datasheet (power, voltage range, efficiency, dimensions, weight); CE/TÜV certificate or DoC; communication docs (register map / CAN DBC); mechanical drawing or 3D model; and cooling specs (flow rate, pressure drop, inlet temperature). Record the overall score per candidate.</w:t>
+            </w:r>
+          </w:p>
+        </w:tc>
+      </w:tr>
+      <w:tr>
+        <w:tc>
+          <w:tcPr>
+            <w:tcW w:type="dxa" w:w="3024"/>
           </w:tcPr>
           <w:p>
             <w:r>
@@ -2411,7 +2347,6 @@
         <w:tc>
           <w:tcPr>
             <w:tcW w:type="dxa" w:w="3024"/>
-            <w:shd w:val="clear" w:color="auto" w:fill="D9E1F2"/>
           </w:tcPr>
           <w:p>
             <w:r>
@@ -2437,7 +2372,6 @@
         <w:tc>
           <w:tcPr>
             <w:tcW w:type="dxa" w:w="3024"/>
-            <w:shd w:val="clear" w:color="auto" w:fill="D9E1F2"/>
           </w:tcPr>
           <w:p>
             <w:r>
@@ -2463,7 +2397,6 @@
         <w:tc>
           <w:tcPr>
             <w:tcW w:type="dxa" w:w="3024"/>
-            <w:shd w:val="clear" w:color="auto" w:fill="D9E1F2"/>
           </w:tcPr>
           <w:p>
             <w:r>
@@ -2487,7 +2420,6 @@
         <w:tc>
           <w:tcPr>
             <w:tcW w:type="dxa" w:w="3024"/>
-            <w:shd w:val="clear" w:color="auto" w:fill="D9E1F2"/>
           </w:tcPr>
           <w:p>
             <w:r>
@@ -2531,7 +2463,6 @@
         <w:tc>
           <w:tcPr>
             <w:tcW w:type="dxa" w:w="3024"/>
-            <w:shd w:val="clear" w:color="auto" w:fill="D9E1F2"/>
           </w:tcPr>
           <w:p>
             <w:r>
@@ -2557,7 +2488,6 @@
         <w:tc>
           <w:tcPr>
             <w:tcW w:type="dxa" w:w="3024"/>
-            <w:shd w:val="clear" w:color="auto" w:fill="D9E1F2"/>
           </w:tcPr>
           <w:p>
             <w:r>
@@ -2583,7 +2513,6 @@
         <w:tc>
           <w:tcPr>
             <w:tcW w:type="dxa" w:w="3024"/>
-            <w:shd w:val="clear" w:color="auto" w:fill="D9E1F2"/>
           </w:tcPr>
           <w:p>
             <w:r>
@@ -2609,7 +2538,6 @@
         <w:tc>
           <w:tcPr>
             <w:tcW w:type="dxa" w:w="3024"/>
-            <w:shd w:val="clear" w:color="auto" w:fill="D9E1F2"/>
           </w:tcPr>
           <w:p>
             <w:r>
@@ -2626,26 +2554,15 @@
           </w:tcPr>
           <w:p>
             <w:r>
-              <w:t>Cross-reference SCORE evaluation results against the must-have checklist (TS-2-01).</w:t>
-              <w:br/>
-              <w:t>1. Take the ranked list of candidates from TS-2-02.</w:t>
-              <w:br/>
-              <w:t>2. For each candidate, verify compliance with each must-have requirement.</w:t>
-              <w:br/>
-              <w:t>3. Mark each requirement Pass (P) / Fail (F) / Unknown (U) per candidate.</w:t>
-              <w:br/>
-              <w:t>4. Identify the top-scoring candidate(s) with ≤ 1 Unknown item.</w:t>
-              <w:br/>
-              <w:t>5. Document any gaps or assumptions for further investigation in TRL 3.</w:t>
-            </w:r>
-          </w:p>
-        </w:tc>
-      </w:tr>
-      <w:tr>
-        <w:tc>
-          <w:tcPr>
-            <w:tcW w:type="dxa" w:w="3024"/>
-            <w:shd w:val="clear" w:color="auto" w:fill="D9E1F2"/>
+              <w:t>Take the ranked candidate list from TS-2-02 and mark each of the 11 must-have requirements Pass/Fail/Unknown per candidate. Identify the top candidate(s) with ≤ 1 Unknown item and document any gaps for follow-up in TRL 3.</w:t>
+            </w:r>
+          </w:p>
+        </w:tc>
+      </w:tr>
+      <w:tr>
+        <w:tc>
+          <w:tcPr>
+            <w:tcW w:type="dxa" w:w="3024"/>
           </w:tcPr>
           <w:p>
             <w:r>
@@ -2673,7 +2590,6 @@
         <w:tc>
           <w:tcPr>
             <w:tcW w:type="dxa" w:w="3024"/>
-            <w:shd w:val="clear" w:color="auto" w:fill="D9E1F2"/>
           </w:tcPr>
           <w:p>
             <w:r>
@@ -2699,7 +2615,6 @@
         <w:tc>
           <w:tcPr>
             <w:tcW w:type="dxa" w:w="3024"/>
-            <w:shd w:val="clear" w:color="auto" w:fill="D9E1F2"/>
           </w:tcPr>
           <w:p>
             <w:r>
@@ -2725,7 +2640,6 @@
         <w:tc>
           <w:tcPr>
             <w:tcW w:type="dxa" w:w="3024"/>
-            <w:shd w:val="clear" w:color="auto" w:fill="D9E1F2"/>
           </w:tcPr>
           <w:p>
             <w:r>
@@ -2749,7 +2663,6 @@
         <w:tc>
           <w:tcPr>
             <w:tcW w:type="dxa" w:w="3024"/>
-            <w:shd w:val="clear" w:color="auto" w:fill="D9E1F2"/>
           </w:tcPr>
           <w:p>
             <w:r>
@@ -2801,7 +2714,6 @@
         <w:tc>
           <w:tcPr>
             <w:tcW w:type="dxa" w:w="3024"/>
-            <w:shd w:val="clear" w:color="auto" w:fill="D9E1F2"/>
           </w:tcPr>
           <w:p>
             <w:r>
@@ -2827,7 +2739,6 @@
         <w:tc>
           <w:tcPr>
             <w:tcW w:type="dxa" w:w="3024"/>
-            <w:shd w:val="clear" w:color="auto" w:fill="D9E1F2"/>
           </w:tcPr>
           <w:p>
             <w:r>
@@ -2853,7 +2764,6 @@
         <w:tc>
           <w:tcPr>
             <w:tcW w:type="dxa" w:w="3024"/>
-            <w:shd w:val="clear" w:color="auto" w:fill="D9E1F2"/>
           </w:tcPr>
           <w:p>
             <w:r>
@@ -2879,7 +2789,6 @@
         <w:tc>
           <w:tcPr>
             <w:tcW w:type="dxa" w:w="3024"/>
-            <w:shd w:val="clear" w:color="auto" w:fill="D9E1F2"/>
           </w:tcPr>
           <w:p>
             <w:r>
@@ -2896,42 +2805,15 @@
           </w:tcPr>
           <w:p>
             <w:r>
-              <w:t>Print or display the draft single-line diagram for a structured design review.</w:t>
-              <w:br/>
-              <w:t>1. Obtain the draft single-line electrical diagram.</w:t>
-              <w:br/>
-              <w:t>2. Verify the following elements are present and correctly connected:</w:t>
-              <w:br/>
-              <w:t>3.   a. AC input: 3P+PE, 400/500 A Powerlock connector</w:t>
-              <w:br/>
-              <w:t>4.   b. AC input protection: circuit breaker rated for C80 (C-type)</w:t>
-              <w:br/>
-              <w:t>5.   c. Galvanic isolation barrier (transformer or equivalent)</w:t>
-              <w:br/>
-              <w:t>6.   d. AC/DC converter module(s)</w:t>
-              <w:br/>
-              <w:t>7.   e. DC output bus: 600–800 VDC range</w:t>
-              <w:br/>
-              <w:t>8.   f. DC output protection (fuse / switch)</w:t>
-              <w:br/>
-              <w:t>9.   g. Liquid-cooling connections</w:t>
-              <w:br/>
-              <w:t>10.   h. Control / communication interface (ModbusTCP / CAN)</w:t>
-              <w:br/>
-              <w:t>11.   i. Earth bonding and protective-earth routing</w:t>
-              <w:br/>
-              <w:t>12. Record any missing elements or design errors.</w:t>
-              <w:br/>
-              <w:t>13. Sign the diagram as reviewed.</w:t>
-            </w:r>
-          </w:p>
-        </w:tc>
-      </w:tr>
-      <w:tr>
-        <w:tc>
-          <w:tcPr>
-            <w:tcW w:type="dxa" w:w="3024"/>
-            <w:shd w:val="clear" w:color="auto" w:fill="D9E1F2"/>
+              <w:t>In a structured design review, confirm the single-line diagram shows all 9 elements correctly connected: AC input (3P+PE, 400/500 A Powerlock); AC protection (C80 C-type breaker); galvanic isolation barrier; AC/DC converter module(s); DC bus (600–800 VDC); DC protection (fuse/switch); liquid-cooling connections; control/comms interface (ModbusTCP/CAN); and PE bonding/routing. Record any missing element or error and sign the diagram.</w:t>
+            </w:r>
+          </w:p>
+        </w:tc>
+      </w:tr>
+      <w:tr>
+        <w:tc>
+          <w:tcPr>
+            <w:tcW w:type="dxa" w:w="3024"/>
           </w:tcPr>
           <w:p>
             <w:r>
@@ -2959,7 +2841,6 @@
         <w:tc>
           <w:tcPr>
             <w:tcW w:type="dxa" w:w="3024"/>
-            <w:shd w:val="clear" w:color="auto" w:fill="D9E1F2"/>
           </w:tcPr>
           <w:p>
             <w:r>
@@ -2985,7 +2866,6 @@
         <w:tc>
           <w:tcPr>
             <w:tcW w:type="dxa" w:w="3024"/>
-            <w:shd w:val="clear" w:color="auto" w:fill="D9E1F2"/>
           </w:tcPr>
           <w:p>
             <w:r>
@@ -3011,7 +2891,6 @@
         <w:tc>
           <w:tcPr>
             <w:tcW w:type="dxa" w:w="3024"/>
-            <w:shd w:val="clear" w:color="auto" w:fill="D9E1F2"/>
           </w:tcPr>
           <w:p>
             <w:r>
@@ -3035,7 +2914,6 @@
         <w:tc>
           <w:tcPr>
             <w:tcW w:type="dxa" w:w="3024"/>
-            <w:shd w:val="clear" w:color="auto" w:fill="D9E1F2"/>
           </w:tcPr>
           <w:p>
             <w:r>
@@ -3079,7 +2957,6 @@
         <w:tc>
           <w:tcPr>
             <w:tcW w:type="dxa" w:w="3024"/>
-            <w:shd w:val="clear" w:color="auto" w:fill="D9E1F2"/>
           </w:tcPr>
           <w:p>
             <w:r>
@@ -3105,7 +2982,6 @@
         <w:tc>
           <w:tcPr>
             <w:tcW w:type="dxa" w:w="3024"/>
-            <w:shd w:val="clear" w:color="auto" w:fill="D9E1F2"/>
           </w:tcPr>
           <w:p>
             <w:r>
@@ -3131,7 +3007,6 @@
         <w:tc>
           <w:tcPr>
             <w:tcW w:type="dxa" w:w="3024"/>
-            <w:shd w:val="clear" w:color="auto" w:fill="D9E1F2"/>
           </w:tcPr>
           <w:p>
             <w:r>
@@ -3157,7 +3032,6 @@
         <w:tc>
           <w:tcPr>
             <w:tcW w:type="dxa" w:w="3024"/>
-            <w:shd w:val="clear" w:color="auto" w:fill="D9E1F2"/>
           </w:tcPr>
           <w:p>
             <w:r>
@@ -3174,30 +3048,15 @@
           </w:tcPr>
           <w:p>
             <w:r>
-              <w:t>Gather efficiency figures from the selected converter module datasheet. Determine system-level losses (converter, cabling, connectors).</w:t>
-              <w:br/>
-              <w:t>1. Obtain full-load efficiency η_converter from datasheet (at rated output power).</w:t>
-              <w:br/>
-              <w:t>2. Estimate cabling + connector losses: P_cable [W].</w:t>
-              <w:br/>
-              <w:t>3. Calculate total input power: P_in = P_out / (η_converter) + P_cable.</w:t>
-              <w:br/>
-              <w:t>4. Calculate total heat dissipation: P_heat = P_in − P_out [W].</w:t>
-              <w:br/>
-              <w:t>5. Calculate system efficiency: η_sys = P_out / P_in × 100 [%].</w:t>
-              <w:br/>
-              <w:t>6. Record η_sys and P_heat in the result field.</w:t>
-              <w:br/>
-              <w:t>7. Compare against limits: η_sys ≥ 97.5 % and P_heat &lt; 7 000 W.</w:t>
-            </w:r>
-          </w:p>
-        </w:tc>
-      </w:tr>
-      <w:tr>
-        <w:tc>
-          <w:tcPr>
-            <w:tcW w:type="dxa" w:w="3024"/>
-            <w:shd w:val="clear" w:color="auto" w:fill="D9E1F2"/>
+              <w:t>From the converter datasheet full-load efficiency and estimated cable/connector losses P_cable, compute P_in = P_out/η_converter + P_cable, heat P_heat = P_in − P_out, and system efficiency η_sys = P_out/P_in × 100. Record η_sys and P_heat and compare against η_sys ≥ 97.5 % and P_heat &lt; 7 000 W.</w:t>
+            </w:r>
+          </w:p>
+        </w:tc>
+      </w:tr>
+      <w:tr>
+        <w:tc>
+          <w:tcPr>
+            <w:tcW w:type="dxa" w:w="3024"/>
           </w:tcPr>
           <w:p>
             <w:r>
@@ -3225,7 +3084,6 @@
         <w:tc>
           <w:tcPr>
             <w:tcW w:type="dxa" w:w="3024"/>
-            <w:shd w:val="clear" w:color="auto" w:fill="D9E1F2"/>
           </w:tcPr>
           <w:p>
             <w:r>
@@ -3251,7 +3109,6 @@
         <w:tc>
           <w:tcPr>
             <w:tcW w:type="dxa" w:w="3024"/>
-            <w:shd w:val="clear" w:color="auto" w:fill="D9E1F2"/>
           </w:tcPr>
           <w:p>
             <w:r>
@@ -3277,7 +3134,6 @@
         <w:tc>
           <w:tcPr>
             <w:tcW w:type="dxa" w:w="3024"/>
-            <w:shd w:val="clear" w:color="auto" w:fill="D9E1F2"/>
           </w:tcPr>
           <w:p>
             <w:r>
@@ -3301,7 +3157,6 @@
         <w:tc>
           <w:tcPr>
             <w:tcW w:type="dxa" w:w="3024"/>
-            <w:shd w:val="clear" w:color="auto" w:fill="D9E1F2"/>
           </w:tcPr>
           <w:p>
             <w:r>
@@ -3345,7 +3200,6 @@
         <w:tc>
           <w:tcPr>
             <w:tcW w:type="dxa" w:w="3024"/>
-            <w:shd w:val="clear" w:color="auto" w:fill="D9E1F2"/>
           </w:tcPr>
           <w:p>
             <w:r>
@@ -3371,7 +3225,6 @@
         <w:tc>
           <w:tcPr>
             <w:tcW w:type="dxa" w:w="3024"/>
-            <w:shd w:val="clear" w:color="auto" w:fill="D9E1F2"/>
           </w:tcPr>
           <w:p>
             <w:r>
@@ -3397,7 +3250,6 @@
         <w:tc>
           <w:tcPr>
             <w:tcW w:type="dxa" w:w="3024"/>
-            <w:shd w:val="clear" w:color="auto" w:fill="D9E1F2"/>
           </w:tcPr>
           <w:p>
             <w:r>
@@ -3423,7 +3275,6 @@
         <w:tc>
           <w:tcPr>
             <w:tcW w:type="dxa" w:w="3024"/>
-            <w:shd w:val="clear" w:color="auto" w:fill="D9E1F2"/>
           </w:tcPr>
           <w:p>
             <w:r>
@@ -3440,28 +3291,15 @@
           </w:tcPr>
           <w:p>
             <w:r>
-              <w:t>Use the mechanical concept description and component datasheets to estimate total dimensions and weight.</w:t>
-              <w:br/>
-              <w:t>1. Obtain mechanical dimensions of the selected converter module(s) from datasheet.</w:t>
-              <w:br/>
-              <w:t>2. Add housing / enclosure dimensions (estimated).</w:t>
-              <w:br/>
-              <w:t>3. Check that overall assembly fits within power-module size envelope (e-PU10 constraint).</w:t>
-              <w:br/>
-              <w:t>4. Sum weights of all components (modules + enclosure + cooling system + cabling).</w:t>
-              <w:br/>
-              <w:t>5. Record total estimated weight [kg].</w:t>
-              <w:br/>
-              <w:t>6. Compare against limit: weight &lt; 500 kg.</w:t>
-            </w:r>
-          </w:p>
-        </w:tc>
-      </w:tr>
-      <w:tr>
-        <w:tc>
-          <w:tcPr>
-            <w:tcW w:type="dxa" w:w="3024"/>
-            <w:shd w:val="clear" w:color="auto" w:fill="D9E1F2"/>
+              <w:t>From the converter datasheet and mechanical concept, add module and enclosure dimensions and confirm the assembly fits the e-PU10 power-module envelope. Sum the weights of modules, enclosure, cooling system and cabling and check total &lt; 500 kg.</w:t>
+            </w:r>
+          </w:p>
+        </w:tc>
+      </w:tr>
+      <w:tr>
+        <w:tc>
+          <w:tcPr>
+            <w:tcW w:type="dxa" w:w="3024"/>
           </w:tcPr>
           <w:p>
             <w:r>
@@ -3489,7 +3327,6 @@
         <w:tc>
           <w:tcPr>
             <w:tcW w:type="dxa" w:w="3024"/>
-            <w:shd w:val="clear" w:color="auto" w:fill="D9E1F2"/>
           </w:tcPr>
           <w:p>
             <w:r>
@@ -3515,7 +3352,6 @@
         <w:tc>
           <w:tcPr>
             <w:tcW w:type="dxa" w:w="3024"/>
-            <w:shd w:val="clear" w:color="auto" w:fill="D9E1F2"/>
           </w:tcPr>
           <w:p>
             <w:r>
@@ -3541,7 +3377,6 @@
         <w:tc>
           <w:tcPr>
             <w:tcW w:type="dxa" w:w="3024"/>
-            <w:shd w:val="clear" w:color="auto" w:fill="D9E1F2"/>
           </w:tcPr>
           <w:p>
             <w:r>
@@ -3565,7 +3400,6 @@
         <w:tc>
           <w:tcPr>
             <w:tcW w:type="dxa" w:w="3024"/>
-            <w:shd w:val="clear" w:color="auto" w:fill="D9E1F2"/>
           </w:tcPr>
           <w:p>
             <w:r>
@@ -3609,7 +3443,6 @@
         <w:tc>
           <w:tcPr>
             <w:tcW w:type="dxa" w:w="3024"/>
-            <w:shd w:val="clear" w:color="auto" w:fill="D9E1F2"/>
           </w:tcPr>
           <w:p>
             <w:r>
@@ -3635,7 +3468,6 @@
         <w:tc>
           <w:tcPr>
             <w:tcW w:type="dxa" w:w="3024"/>
-            <w:shd w:val="clear" w:color="auto" w:fill="D9E1F2"/>
           </w:tcPr>
           <w:p>
             <w:r>
@@ -3661,7 +3493,6 @@
         <w:tc>
           <w:tcPr>
             <w:tcW w:type="dxa" w:w="3024"/>
-            <w:shd w:val="clear" w:color="auto" w:fill="D9E1F2"/>
           </w:tcPr>
           <w:p>
             <w:r>
@@ -3687,7 +3518,6 @@
         <w:tc>
           <w:tcPr>
             <w:tcW w:type="dxa" w:w="3024"/>
-            <w:shd w:val="clear" w:color="auto" w:fill="D9E1F2"/>
           </w:tcPr>
           <w:p>
             <w:r>
@@ -3704,28 +3534,15 @@
           </w:tcPr>
           <w:p>
             <w:r>
-              <w:t>Compile a preliminary BOM from the conceptual design and obtain unit prices from TS-2-02 supplier list.</w:t>
-              <w:br/>
-              <w:t>1. List all major components: converter module(s), enclosure, cooling components, connectors, cables, protection devices, control hardware.</w:t>
-              <w:br/>
-              <w:t>2. Obtain unit price for each component (quotation or list price).</w:t>
-              <w:br/>
-              <w:t>3. Calculate total BOM cost: Σ (quantity × unit price) [€].</w:t>
-              <w:br/>
-              <w:t>4. Add 15 % contingency for unknown items.</w:t>
-              <w:br/>
-              <w:t>5. Record total estimated material cost [€].</w:t>
-              <w:br/>
-              <w:t>6. Compare against limit: &lt; €20,000.</w:t>
-            </w:r>
-          </w:p>
-        </w:tc>
-      </w:tr>
-      <w:tr>
-        <w:tc>
-          <w:tcPr>
-            <w:tcW w:type="dxa" w:w="3024"/>
-            <w:shd w:val="clear" w:color="auto" w:fill="D9E1F2"/>
+              <w:t>Compile a preliminary BOM (converter module(s), enclosure, cooling components, connectors, cables, protection devices, control hardware) with unit prices from the TS-2-02 supplier list. Sum Σ(qty × unit price), add 15 % contingency, and check total &lt; €20,000.</w:t>
+            </w:r>
+          </w:p>
+        </w:tc>
+      </w:tr>
+      <w:tr>
+        <w:tc>
+          <w:tcPr>
+            <w:tcW w:type="dxa" w:w="3024"/>
           </w:tcPr>
           <w:p>
             <w:r>
@@ -3753,7 +3570,6 @@
         <w:tc>
           <w:tcPr>
             <w:tcW w:type="dxa" w:w="3024"/>
-            <w:shd w:val="clear" w:color="auto" w:fill="D9E1F2"/>
           </w:tcPr>
           <w:p>
             <w:r>
@@ -3779,7 +3595,6 @@
         <w:tc>
           <w:tcPr>
             <w:tcW w:type="dxa" w:w="3024"/>
-            <w:shd w:val="clear" w:color="auto" w:fill="D9E1F2"/>
           </w:tcPr>
           <w:p>
             <w:r>
@@ -3805,7 +3620,6 @@
         <w:tc>
           <w:tcPr>
             <w:tcW w:type="dxa" w:w="3024"/>
-            <w:shd w:val="clear" w:color="auto" w:fill="D9E1F2"/>
           </w:tcPr>
           <w:p>
             <w:r>
@@ -3829,7 +3643,6 @@
         <w:tc>
           <w:tcPr>
             <w:tcW w:type="dxa" w:w="3024"/>
-            <w:shd w:val="clear" w:color="auto" w:fill="D9E1F2"/>
           </w:tcPr>
           <w:p>
             <w:r>
@@ -3881,7 +3694,6 @@
         <w:tc>
           <w:tcPr>
             <w:tcW w:type="dxa" w:w="3024"/>
-            <w:shd w:val="clear" w:color="auto" w:fill="D9E1F2"/>
           </w:tcPr>
           <w:p>
             <w:r>
@@ -3907,7 +3719,6 @@
         <w:tc>
           <w:tcPr>
             <w:tcW w:type="dxa" w:w="3024"/>
-            <w:shd w:val="clear" w:color="auto" w:fill="D9E1F2"/>
           </w:tcPr>
           <w:p>
             <w:r>
@@ -3933,7 +3744,6 @@
         <w:tc>
           <w:tcPr>
             <w:tcW w:type="dxa" w:w="3024"/>
-            <w:shd w:val="clear" w:color="auto" w:fill="D9E1F2"/>
           </w:tcPr>
           <w:p>
             <w:r>
@@ -3959,7 +3769,6 @@
         <w:tc>
           <w:tcPr>
             <w:tcW w:type="dxa" w:w="3024"/>
-            <w:shd w:val="clear" w:color="auto" w:fill="D9E1F2"/>
           </w:tcPr>
           <w:p>
             <w:r>
@@ -3976,28 +3785,15 @@
           </w:tcPr>
           <w:p>
             <w:r>
-              <w:t>Review the converter module's isolation test report or certificate. Confirm isolation voltage, creepage and clearance from the datasheet.</w:t>
-              <w:br/>
-              <w:t>1. Obtain the converter module's dielectric withstand / hi-pot test report.</w:t>
-              <w:br/>
-              <w:t>2. Check that the reported test voltage meets or exceeds the IEC 61439 requirement for the rated working voltage.</w:t>
-              <w:br/>
-              <w:t>3. Verify creepage and clearance values against IEC 61439 Table F.2.</w:t>
-              <w:br/>
-              <w:t>4. Confirm that the module is described as 'galvanically isolated' in the datasheet.</w:t>
-              <w:br/>
-              <w:t>5. Record: test voltage [V], isolation class, creepage [mm], clearance [mm].</w:t>
-              <w:br/>
-              <w:t>6. If no test report is available, flag as action item for TRL 6 physical test.</w:t>
-            </w:r>
-          </w:p>
-        </w:tc>
-      </w:tr>
-      <w:tr>
-        <w:tc>
-          <w:tcPr>
-            <w:tcW w:type="dxa" w:w="3024"/>
-            <w:shd w:val="clear" w:color="auto" w:fill="D9E1F2"/>
+              <w:t>From the converter dielectric-withstand / hi-pot report, confirm the test voltage meets or exceeds the IEC 61439 requirement for the rated working voltage, verify creepage and clearance against IEC 61439 Table F.2, and confirm the datasheet states galvanic isolation. Record test voltage, isolation class, creepage and clearance; if no report exists, flag for the TRL 6 physical test.</w:t>
+            </w:r>
+          </w:p>
+        </w:tc>
+      </w:tr>
+      <w:tr>
+        <w:tc>
+          <w:tcPr>
+            <w:tcW w:type="dxa" w:w="3024"/>
           </w:tcPr>
           <w:p>
             <w:r>
@@ -4025,7 +3821,6 @@
         <w:tc>
           <w:tcPr>
             <w:tcW w:type="dxa" w:w="3024"/>
-            <w:shd w:val="clear" w:color="auto" w:fill="D9E1F2"/>
           </w:tcPr>
           <w:p>
             <w:r>
@@ -4051,7 +3846,6 @@
         <w:tc>
           <w:tcPr>
             <w:tcW w:type="dxa" w:w="3024"/>
-            <w:shd w:val="clear" w:color="auto" w:fill="D9E1F2"/>
           </w:tcPr>
           <w:p>
             <w:r>
@@ -4077,7 +3871,6 @@
         <w:tc>
           <w:tcPr>
             <w:tcW w:type="dxa" w:w="3024"/>
-            <w:shd w:val="clear" w:color="auto" w:fill="D9E1F2"/>
           </w:tcPr>
           <w:p>
             <w:r>
@@ -4101,7 +3894,6 @@
         <w:tc>
           <w:tcPr>
             <w:tcW w:type="dxa" w:w="3024"/>
-            <w:shd w:val="clear" w:color="auto" w:fill="D9E1F2"/>
           </w:tcPr>
           <w:p>
             <w:r>
@@ -4145,7 +3937,6 @@
         <w:tc>
           <w:tcPr>
             <w:tcW w:type="dxa" w:w="3024"/>
-            <w:shd w:val="clear" w:color="auto" w:fill="D9E1F2"/>
           </w:tcPr>
           <w:p>
             <w:r>
@@ -4171,7 +3962,6 @@
         <w:tc>
           <w:tcPr>
             <w:tcW w:type="dxa" w:w="3024"/>
-            <w:shd w:val="clear" w:color="auto" w:fill="D9E1F2"/>
           </w:tcPr>
           <w:p>
             <w:r>
@@ -4197,7 +3987,6 @@
         <w:tc>
           <w:tcPr>
             <w:tcW w:type="dxa" w:w="3024"/>
-            <w:shd w:val="clear" w:color="auto" w:fill="D9E1F2"/>
           </w:tcPr>
           <w:p>
             <w:r>
@@ -4223,7 +4012,6 @@
         <w:tc>
           <w:tcPr>
             <w:tcW w:type="dxa" w:w="3024"/>
-            <w:shd w:val="clear" w:color="auto" w:fill="D9E1F2"/>
           </w:tcPr>
           <w:p>
             <w:r>
@@ -4240,26 +4028,15 @@
           </w:tcPr>
           <w:p>
             <w:r>
-              <w:t>Review datasheet output voltage range specification.</w:t>
-              <w:br/>
-              <w:t>1. Obtain the DC output voltage range from the converter module datasheet.</w:t>
-              <w:br/>
-              <w:t>2. Record minimum and maximum DC output voltage [V].</w:t>
-              <w:br/>
-              <w:t>3. Verify minimum ≤ 600 V and maximum ≥ 800 V.</w:t>
-              <w:br/>
-              <w:t>4. Check that the voltage regulation accuracy meets requirements (e.g. ± 1 %).</w:t>
-              <w:br/>
-              <w:t>5. Confirm that the range is achievable via the communication interface (register / command).</w:t>
-            </w:r>
-          </w:p>
-        </w:tc>
-      </w:tr>
-      <w:tr>
-        <w:tc>
-          <w:tcPr>
-            <w:tcW w:type="dxa" w:w="3024"/>
-            <w:shd w:val="clear" w:color="auto" w:fill="D9E1F2"/>
+              <w:t>From the converter datasheet, record the DC output V_min and V_max and confirm V_min ≤ 600 V and V_max ≥ 800 V. Check voltage-regulation accuracy (e.g. ± 1 %) and that the range is settable via the communication interface.</w:t>
+            </w:r>
+          </w:p>
+        </w:tc>
+      </w:tr>
+      <w:tr>
+        <w:tc>
+          <w:tcPr>
+            <w:tcW w:type="dxa" w:w="3024"/>
           </w:tcPr>
           <w:p>
             <w:r>
@@ -4287,7 +4064,6 @@
         <w:tc>
           <w:tcPr>
             <w:tcW w:type="dxa" w:w="3024"/>
-            <w:shd w:val="clear" w:color="auto" w:fill="D9E1F2"/>
           </w:tcPr>
           <w:p>
             <w:r>
@@ -4313,7 +4089,6 @@
         <w:tc>
           <w:tcPr>
             <w:tcW w:type="dxa" w:w="3024"/>
-            <w:shd w:val="clear" w:color="auto" w:fill="D9E1F2"/>
           </w:tcPr>
           <w:p>
             <w:r>
@@ -4339,7 +4114,6 @@
         <w:tc>
           <w:tcPr>
             <w:tcW w:type="dxa" w:w="3024"/>
-            <w:shd w:val="clear" w:color="auto" w:fill="D9E1F2"/>
           </w:tcPr>
           <w:p>
             <w:r>
@@ -4363,7 +4137,6 @@
         <w:tc>
           <w:tcPr>
             <w:tcW w:type="dxa" w:w="3024"/>
-            <w:shd w:val="clear" w:color="auto" w:fill="D9E1F2"/>
           </w:tcPr>
           <w:p>
             <w:r>
@@ -4407,7 +4180,6 @@
         <w:tc>
           <w:tcPr>
             <w:tcW w:type="dxa" w:w="3024"/>
-            <w:shd w:val="clear" w:color="auto" w:fill="D9E1F2"/>
           </w:tcPr>
           <w:p>
             <w:r>
@@ -4433,7 +4205,6 @@
         <w:tc>
           <w:tcPr>
             <w:tcW w:type="dxa" w:w="3024"/>
-            <w:shd w:val="clear" w:color="auto" w:fill="D9E1F2"/>
           </w:tcPr>
           <w:p>
             <w:r>
@@ -4459,7 +4230,6 @@
         <w:tc>
           <w:tcPr>
             <w:tcW w:type="dxa" w:w="3024"/>
-            <w:shd w:val="clear" w:color="auto" w:fill="D9E1F2"/>
           </w:tcPr>
           <w:p>
             <w:r>
@@ -4485,7 +4255,6 @@
         <w:tc>
           <w:tcPr>
             <w:tcW w:type="dxa" w:w="3024"/>
-            <w:shd w:val="clear" w:color="auto" w:fill="D9E1F2"/>
           </w:tcPr>
           <w:p>
             <w:r>
@@ -4502,26 +4271,15 @@
           </w:tcPr>
           <w:p>
             <w:r>
-              <w:t>Review the communication register map for minimum power / current setpoint resolution.</w:t>
-              <w:br/>
-              <w:t>1. Obtain the minimum power / current setpoint value from the datasheet or register map.</w:t>
-              <w:br/>
-              <w:t>2. Record P_min [kW] and I_min [A].</w:t>
-              <w:br/>
-              <w:t>3. Verify P_min ≤ 55 kW and I_min ≤ 80 A (i.e. the charger CAN be set as low as these values).</w:t>
-              <w:br/>
-              <w:t>4. Check setpoint resolution (step size) is ≤ 1 kW or ≤ 1 A.</w:t>
-              <w:br/>
-              <w:t>5. Additionally check if recommended minimum (20 kW / 32 A) is achievable.</w:t>
-            </w:r>
-          </w:p>
-        </w:tc>
-      </w:tr>
-      <w:tr>
-        <w:tc>
-          <w:tcPr>
-            <w:tcW w:type="dxa" w:w="3024"/>
-            <w:shd w:val="clear" w:color="auto" w:fill="D9E1F2"/>
+              <w:t>From the datasheet / register map, record minimum settable P_min [kW] and I_min [A] and confirm P_min ≤ 55 kW and I_min ≤ 80 A with a setpoint resolution ≤ 1 kW/1 A. Also check whether the recommended minimum (20 kW / 32 A) is achievable.</w:t>
+            </w:r>
+          </w:p>
+        </w:tc>
+      </w:tr>
+      <w:tr>
+        <w:tc>
+          <w:tcPr>
+            <w:tcW w:type="dxa" w:w="3024"/>
           </w:tcPr>
           <w:p>
             <w:r>
@@ -4549,7 +4307,6 @@
         <w:tc>
           <w:tcPr>
             <w:tcW w:type="dxa" w:w="3024"/>
-            <w:shd w:val="clear" w:color="auto" w:fill="D9E1F2"/>
           </w:tcPr>
           <w:p>
             <w:r>
@@ -4575,7 +4332,6 @@
         <w:tc>
           <w:tcPr>
             <w:tcW w:type="dxa" w:w="3024"/>
-            <w:shd w:val="clear" w:color="auto" w:fill="D9E1F2"/>
           </w:tcPr>
           <w:p>
             <w:r>
@@ -4601,7 +4357,6 @@
         <w:tc>
           <w:tcPr>
             <w:tcW w:type="dxa" w:w="3024"/>
-            <w:shd w:val="clear" w:color="auto" w:fill="D9E1F2"/>
           </w:tcPr>
           <w:p>
             <w:r>
@@ -4625,7 +4380,6 @@
         <w:tc>
           <w:tcPr>
             <w:tcW w:type="dxa" w:w="3024"/>
-            <w:shd w:val="clear" w:color="auto" w:fill="D9E1F2"/>
           </w:tcPr>
           <w:p>
             <w:r>
@@ -4669,7 +4423,6 @@
         <w:tc>
           <w:tcPr>
             <w:tcW w:type="dxa" w:w="3024"/>
-            <w:shd w:val="clear" w:color="auto" w:fill="D9E1F2"/>
           </w:tcPr>
           <w:p>
             <w:r>
@@ -4695,7 +4448,6 @@
         <w:tc>
           <w:tcPr>
             <w:tcW w:type="dxa" w:w="3024"/>
-            <w:shd w:val="clear" w:color="auto" w:fill="D9E1F2"/>
           </w:tcPr>
           <w:p>
             <w:r>
@@ -4721,7 +4473,6 @@
         <w:tc>
           <w:tcPr>
             <w:tcW w:type="dxa" w:w="3024"/>
-            <w:shd w:val="clear" w:color="auto" w:fill="D9E1F2"/>
           </w:tcPr>
           <w:p>
             <w:r>
@@ -4747,7 +4498,6 @@
         <w:tc>
           <w:tcPr>
             <w:tcW w:type="dxa" w:w="3024"/>
-            <w:shd w:val="clear" w:color="auto" w:fill="D9E1F2"/>
           </w:tcPr>
           <w:p>
             <w:r>
@@ -4764,36 +4514,15 @@
           </w:tcPr>
           <w:p>
             <w:r>
-              <w:t>Review the software architecture document and communication register map. Confirm that the implemented protocol matches a supported option.</w:t>
-              <w:br/>
-              <w:t>1. Identify the communication protocol implemented in the detailed design.</w:t>
-              <w:br/>
-              <w:t>2. Verify the protocol is one of: ModbusTCP (preferred), CAN, Profinet, EtherCAT.</w:t>
-              <w:br/>
-              <w:t>3. Obtain the complete register map (Modbus) or DBC file (CAN).</w:t>
-              <w:br/>
-              <w:t>4. Check that all required control commands are mapped:</w:t>
-              <w:br/>
-              <w:t>5.   a. Enable / disable charging</w:t>
-              <w:br/>
-              <w:t>6.   b. Set output power [kW] or current [A]</w:t>
-              <w:br/>
-              <w:t>7.   c. Set output voltage [V]</w:t>
-              <w:br/>
-              <w:t>8.   d. Read measured output power, current, voltage</w:t>
-              <w:br/>
-              <w:t>9.   e. Read fault / status word</w:t>
-              <w:br/>
-              <w:t>10. Verify that the register map is versioned and included in the documentation package.</w:t>
-            </w:r>
-          </w:p>
-        </w:tc>
-      </w:tr>
-      <w:tr>
-        <w:tc>
-          <w:tcPr>
-            <w:tcW w:type="dxa" w:w="3024"/>
-            <w:shd w:val="clear" w:color="auto" w:fill="D9E1F2"/>
+              <w:t>Confirm the implemented protocol is one of ModbusTCP (preferred), CAN, Profinet or EtherCAT, and that the versioned register map / DBC maps all 5 required commands: enable/disable charging; set output power or current; set output voltage; read measured power/current/voltage; and read fault/status word. Verify the map is in the documentation package.</w:t>
+            </w:r>
+          </w:p>
+        </w:tc>
+      </w:tr>
+      <w:tr>
+        <w:tc>
+          <w:tcPr>
+            <w:tcW w:type="dxa" w:w="3024"/>
           </w:tcPr>
           <w:p>
             <w:r>
@@ -4821,7 +4550,6 @@
         <w:tc>
           <w:tcPr>
             <w:tcW w:type="dxa" w:w="3024"/>
-            <w:shd w:val="clear" w:color="auto" w:fill="D9E1F2"/>
           </w:tcPr>
           <w:p>
             <w:r>
@@ -4847,7 +4575,6 @@
         <w:tc>
           <w:tcPr>
             <w:tcW w:type="dxa" w:w="3024"/>
-            <w:shd w:val="clear" w:color="auto" w:fill="D9E1F2"/>
           </w:tcPr>
           <w:p>
             <w:r>
@@ -4873,7 +4600,6 @@
         <w:tc>
           <w:tcPr>
             <w:tcW w:type="dxa" w:w="3024"/>
-            <w:shd w:val="clear" w:color="auto" w:fill="D9E1F2"/>
           </w:tcPr>
           <w:p>
             <w:r>
@@ -4897,7 +4623,6 @@
         <w:tc>
           <w:tcPr>
             <w:tcW w:type="dxa" w:w="3024"/>
-            <w:shd w:val="clear" w:color="auto" w:fill="D9E1F2"/>
           </w:tcPr>
           <w:p>
             <w:r>
@@ -4941,7 +4666,6 @@
         <w:tc>
           <w:tcPr>
             <w:tcW w:type="dxa" w:w="3024"/>
-            <w:shd w:val="clear" w:color="auto" w:fill="D9E1F2"/>
           </w:tcPr>
           <w:p>
             <w:r>
@@ -4967,7 +4691,6 @@
         <w:tc>
           <w:tcPr>
             <w:tcW w:type="dxa" w:w="3024"/>
-            <w:shd w:val="clear" w:color="auto" w:fill="D9E1F2"/>
           </w:tcPr>
           <w:p>
             <w:r>
@@ -4993,7 +4716,6 @@
         <w:tc>
           <w:tcPr>
             <w:tcW w:type="dxa" w:w="3024"/>
-            <w:shd w:val="clear" w:color="auto" w:fill="D9E1F2"/>
           </w:tcPr>
           <w:p>
             <w:r>
@@ -5019,7 +4741,6 @@
         <w:tc>
           <w:tcPr>
             <w:tcW w:type="dxa" w:w="3024"/>
-            <w:shd w:val="clear" w:color="auto" w:fill="D9E1F2"/>
           </w:tcPr>
           <w:p>
             <w:r>
@@ -5036,32 +4757,15 @@
           </w:tcPr>
           <w:p>
             <w:r>
-              <w:t>Review detailed electrical drawings and the converter module's EMC certificate (if available) against the IEC 61000 industrial EMC class requirements.</w:t>
-              <w:br/>
-              <w:t>1. Check that the converter module has an EMC test report or CE declaration covering IEC 61000.</w:t>
-              <w:br/>
-              <w:t>2. Review the electrical drawings for the following EMC design features:</w:t>
-              <w:br/>
-              <w:t>3.   a. Input EMC filter (line filter) is specified</w:t>
-              <w:br/>
-              <w:t>4.   b. Cable shielding plan is documented</w:t>
-              <w:br/>
-              <w:t>5.   c. PE / ground bonding topology is defined</w:t>
-              <w:br/>
-              <w:t>6.   d. Separation of high-current power cables from signal cables is planned</w:t>
-              <w:br/>
-              <w:t>7. Identify any gaps in EMC design and log as action items.</w:t>
-              <w:br/>
-              <w:t>8. Record the EMC class of the converter module from its datasheet/certificate.</w:t>
-            </w:r>
-          </w:p>
-        </w:tc>
-      </w:tr>
-      <w:tr>
-        <w:tc>
-          <w:tcPr>
-            <w:tcW w:type="dxa" w:w="3024"/>
-            <w:shd w:val="clear" w:color="auto" w:fill="D9E1F2"/>
+              <w:t>Confirm the converter has an EMC report / CE declaration covering IEC 61000 and record its EMC class, then review the electrical drawings for the 4 EMC measures: input EMC/line filter; cable shielding plan; PE/ground bonding topology; and separation of power from signal cables. Log any gaps as action items.</w:t>
+            </w:r>
+          </w:p>
+        </w:tc>
+      </w:tr>
+      <w:tr>
+        <w:tc>
+          <w:tcPr>
+            <w:tcW w:type="dxa" w:w="3024"/>
           </w:tcPr>
           <w:p>
             <w:r>
@@ -5089,7 +4793,6 @@
         <w:tc>
           <w:tcPr>
             <w:tcW w:type="dxa" w:w="3024"/>
-            <w:shd w:val="clear" w:color="auto" w:fill="D9E1F2"/>
           </w:tcPr>
           <w:p>
             <w:r>
@@ -5115,7 +4818,6 @@
         <w:tc>
           <w:tcPr>
             <w:tcW w:type="dxa" w:w="3024"/>
-            <w:shd w:val="clear" w:color="auto" w:fill="D9E1F2"/>
           </w:tcPr>
           <w:p>
             <w:r>
@@ -5141,7 +4843,6 @@
         <w:tc>
           <w:tcPr>
             <w:tcW w:type="dxa" w:w="3024"/>
-            <w:shd w:val="clear" w:color="auto" w:fill="D9E1F2"/>
           </w:tcPr>
           <w:p>
             <w:r>
@@ -5165,7 +4866,6 @@
         <w:tc>
           <w:tcPr>
             <w:tcW w:type="dxa" w:w="3024"/>
-            <w:shd w:val="clear" w:color="auto" w:fill="D9E1F2"/>
           </w:tcPr>
           <w:p>
             <w:r>
@@ -5209,7 +4909,6 @@
         <w:tc>
           <w:tcPr>
             <w:tcW w:type="dxa" w:w="3024"/>
-            <w:shd w:val="clear" w:color="auto" w:fill="D9E1F2"/>
           </w:tcPr>
           <w:p>
             <w:r>
@@ -5235,7 +4934,6 @@
         <w:tc>
           <w:tcPr>
             <w:tcW w:type="dxa" w:w="3024"/>
-            <w:shd w:val="clear" w:color="auto" w:fill="D9E1F2"/>
           </w:tcPr>
           <w:p>
             <w:r>
@@ -5261,7 +4959,6 @@
         <w:tc>
           <w:tcPr>
             <w:tcW w:type="dxa" w:w="3024"/>
-            <w:shd w:val="clear" w:color="auto" w:fill="D9E1F2"/>
           </w:tcPr>
           <w:p>
             <w:r>
@@ -5287,7 +4984,6 @@
         <w:tc>
           <w:tcPr>
             <w:tcW w:type="dxa" w:w="3024"/>
-            <w:shd w:val="clear" w:color="auto" w:fill="D9E1F2"/>
           </w:tcPr>
           <w:p>
             <w:r>
@@ -5304,30 +5000,15 @@
           </w:tcPr>
           <w:p>
             <w:r>
-              <w:t>Obtain the converter module cooling requirements from the datasheet. Obtain the e-PU10 cooling system parameters (available flow rate, max pressure drop, inlet temperature).</w:t>
-              <w:br/>
-              <w:t>1. Record required coolant flow rate from converter datasheet [L/min].</w:t>
-              <w:br/>
-              <w:t>2. Record maximum allowable pressure drop [bar].</w:t>
-              <w:br/>
-              <w:t>3. Record maximum inlet coolant temperature [°C].</w:t>
-              <w:br/>
-              <w:t>4. Verify that the e-PU10 cooling system can supply the required flow rate and inlet temperature.</w:t>
-              <w:br/>
-              <w:t>5. Calculate heat removal capacity: Q = ṁ × c_p × ΔT [W], where ΔT = T_out − T_in.</w:t>
-              <w:br/>
-              <w:t>6. Verify Q ≥ P_heat from TS-3-02 (&lt; 7 000 W).</w:t>
-              <w:br/>
-              <w:t>7. Check that all cooling connections (inlet, outlet, venting) are included in the mechanical drawing.</w:t>
-            </w:r>
-          </w:p>
-        </w:tc>
-      </w:tr>
-      <w:tr>
-        <w:tc>
-          <w:tcPr>
-            <w:tcW w:type="dxa" w:w="3024"/>
-            <w:shd w:val="clear" w:color="auto" w:fill="D9E1F2"/>
+              <w:t>From the converter datasheet record required coolant flow rate, max pressure drop and max inlet temperature, and confirm the e-PU10 cooling system can supply them. Compute heat removal Q = ṁ × c_p × ΔT and verify Q ≥ P_heat from TS-3-02 (&lt; 7 000 W). Check all cooling connections (inlet, outlet, venting) appear on the mechanical drawing.</w:t>
+            </w:r>
+          </w:p>
+        </w:tc>
+      </w:tr>
+      <w:tr>
+        <w:tc>
+          <w:tcPr>
+            <w:tcW w:type="dxa" w:w="3024"/>
           </w:tcPr>
           <w:p>
             <w:r>
@@ -5355,7 +5036,6 @@
         <w:tc>
           <w:tcPr>
             <w:tcW w:type="dxa" w:w="3024"/>
-            <w:shd w:val="clear" w:color="auto" w:fill="D9E1F2"/>
           </w:tcPr>
           <w:p>
             <w:r>
@@ -5381,7 +5061,6 @@
         <w:tc>
           <w:tcPr>
             <w:tcW w:type="dxa" w:w="3024"/>
-            <w:shd w:val="clear" w:color="auto" w:fill="D9E1F2"/>
           </w:tcPr>
           <w:p>
             <w:r>
@@ -5407,7 +5086,6 @@
         <w:tc>
           <w:tcPr>
             <w:tcW w:type="dxa" w:w="3024"/>
-            <w:shd w:val="clear" w:color="auto" w:fill="D9E1F2"/>
           </w:tcPr>
           <w:p>
             <w:r>
@@ -5431,7 +5109,6 @@
         <w:tc>
           <w:tcPr>
             <w:tcW w:type="dxa" w:w="3024"/>
-            <w:shd w:val="clear" w:color="auto" w:fill="D9E1F2"/>
           </w:tcPr>
           <w:p>
             <w:r>
@@ -5483,7 +5160,6 @@
         <w:tc>
           <w:tcPr>
             <w:tcW w:type="dxa" w:w="3024"/>
-            <w:shd w:val="clear" w:color="auto" w:fill="D9E1F2"/>
           </w:tcPr>
           <w:p>
             <w:r>
@@ -5509,7 +5185,6 @@
         <w:tc>
           <w:tcPr>
             <w:tcW w:type="dxa" w:w="3024"/>
-            <w:shd w:val="clear" w:color="auto" w:fill="D9E1F2"/>
           </w:tcPr>
           <w:p>
             <w:r>
@@ -5535,7 +5210,6 @@
         <w:tc>
           <w:tcPr>
             <w:tcW w:type="dxa" w:w="3024"/>
-            <w:shd w:val="clear" w:color="auto" w:fill="D9E1F2"/>
           </w:tcPr>
           <w:p>
             <w:r>
@@ -5561,7 +5235,6 @@
         <w:tc>
           <w:tcPr>
             <w:tcW w:type="dxa" w:w="3024"/>
-            <w:shd w:val="clear" w:color="auto" w:fill="D9E1F2"/>
           </w:tcPr>
           <w:p>
             <w:r>
@@ -5578,30 +5251,15 @@
           </w:tcPr>
           <w:p>
             <w:r>
-              <w:t>Connect charger to a 3-phase 400 V AC supply via a C80 breaker. Connect DC output to a calibrated electronic load. Ambient temperature shall be 25 °C ± 3 °C (verify with calibrated thermometer). Allow system to stabilise for 10 minutes before test.</w:t>
-              <w:br/>
-              <w:t>1. Set DC load to rated output voltage (within 600–800 VDC range, as specified).</w:t>
-              <w:br/>
-              <w:t>2. Command charger to 100 % rated power via communication interface.</w:t>
-              <w:br/>
-              <w:t>3. Start timer.</w:t>
-              <w:br/>
-              <w:t>4. Record: AC input power [kW], DC output power [kW], DC output voltage [V], DC output current [A], ambient temperature [°C] at T = 0, 15, 30, 45, 60 min.</w:t>
-              <w:br/>
-              <w:t>5. Monitor for any fault indication, shutdown or thermal de-rating event.</w:t>
-              <w:br/>
-              <w:t>6. After 60 min continuous operation, record final values.</w:t>
-              <w:br/>
-              <w:t>7. Stop charger and record any alarm codes.</w:t>
-            </w:r>
-          </w:p>
-        </w:tc>
-      </w:tr>
-      <w:tr>
-        <w:tc>
-          <w:tcPr>
-            <w:tcW w:type="dxa" w:w="3024"/>
-            <w:shd w:val="clear" w:color="auto" w:fill="D9E1F2"/>
+              <w:t>Connect the charger to a 3-phase 400 V AC supply via a C80 breaker and the DC output to a calibrated electronic load set within 600–800 VDC, at 25 °C ± 3 °C ambient; stabilise for 10 min. Command 100 % rated power and run 60 min, recording AC/DC power, DC voltage/current and ambient at 0/15/30/45/60 min while monitoring for any fault, shutdown or thermal de-rating; log final values and alarm codes.</w:t>
+            </w:r>
+          </w:p>
+        </w:tc>
+      </w:tr>
+      <w:tr>
+        <w:tc>
+          <w:tcPr>
+            <w:tcW w:type="dxa" w:w="3024"/>
           </w:tcPr>
           <w:p>
             <w:r>
@@ -5629,7 +5287,6 @@
         <w:tc>
           <w:tcPr>
             <w:tcW w:type="dxa" w:w="3024"/>
-            <w:shd w:val="clear" w:color="auto" w:fill="D9E1F2"/>
           </w:tcPr>
           <w:p>
             <w:r>
@@ -5655,7 +5312,6 @@
         <w:tc>
           <w:tcPr>
             <w:tcW w:type="dxa" w:w="3024"/>
-            <w:shd w:val="clear" w:color="auto" w:fill="D9E1F2"/>
           </w:tcPr>
           <w:p>
             <w:r>
@@ -5681,7 +5337,6 @@
         <w:tc>
           <w:tcPr>
             <w:tcW w:type="dxa" w:w="3024"/>
-            <w:shd w:val="clear" w:color="auto" w:fill="D9E1F2"/>
           </w:tcPr>
           <w:p>
             <w:r>
@@ -5705,7 +5360,6 @@
         <w:tc>
           <w:tcPr>
             <w:tcW w:type="dxa" w:w="3024"/>
-            <w:shd w:val="clear" w:color="auto" w:fill="D9E1F2"/>
           </w:tcPr>
           <w:p>
             <w:r>
@@ -5749,7 +5403,6 @@
         <w:tc>
           <w:tcPr>
             <w:tcW w:type="dxa" w:w="3024"/>
-            <w:shd w:val="clear" w:color="auto" w:fill="D9E1F2"/>
           </w:tcPr>
           <w:p>
             <w:r>
@@ -5775,7 +5428,6 @@
         <w:tc>
           <w:tcPr>
             <w:tcW w:type="dxa" w:w="3024"/>
-            <w:shd w:val="clear" w:color="auto" w:fill="D9E1F2"/>
           </w:tcPr>
           <w:p>
             <w:r>
@@ -5801,7 +5453,6 @@
         <w:tc>
           <w:tcPr>
             <w:tcW w:type="dxa" w:w="3024"/>
-            <w:shd w:val="clear" w:color="auto" w:fill="D9E1F2"/>
           </w:tcPr>
           <w:p>
             <w:r>
@@ -5827,7 +5478,6 @@
         <w:tc>
           <w:tcPr>
             <w:tcW w:type="dxa" w:w="3024"/>
-            <w:shd w:val="clear" w:color="auto" w:fill="D9E1F2"/>
           </w:tcPr>
           <w:p>
             <w:r>
@@ -5844,30 +5494,15 @@
           </w:tcPr>
           <w:p>
             <w:r>
-              <w:t>Same setup as TS-6-01. Both AC and DC power analysers shall be connected simultaneously. Ensure all auxiliary power (fans, controls) is included in the AC measurement.</w:t>
-              <w:br/>
-              <w:t>1. With charger running at 100 % rated load (as per TS-6-01, steady state):</w:t>
-              <w:br/>
-              <w:t>2. Record simultaneous AC input power P_AC_in [W] from AC analyser.</w:t>
-              <w:br/>
-              <w:t>3. Record simultaneous DC output power P_DC_out [W] from DC analyser.</w:t>
-              <w:br/>
-              <w:t>4. Calculate system efficiency: η = P_DC_out / P_AC_in × 100 [%].</w:t>
-              <w:br/>
-              <w:t>5. Repeat measurement at 75 % and 50 % rated load.</w:t>
-              <w:br/>
-              <w:t>6. Record efficiency at each load point.</w:t>
-              <w:br/>
-              <w:t>7. Calculate total heat dissipation: P_heat = P_AC_in − P_DC_out [W] at 100 % load.</w:t>
-            </w:r>
-          </w:p>
-        </w:tc>
-      </w:tr>
-      <w:tr>
-        <w:tc>
-          <w:tcPr>
-            <w:tcW w:type="dxa" w:w="3024"/>
-            <w:shd w:val="clear" w:color="auto" w:fill="D9E1F2"/>
+              <w:t>Using the TS-6-01 setup with AC and DC power analysers connected simultaneously (auxiliary power included in the AC measurement), record P_AC_in and P_DC_out at steady state and compute η = P_DC_out/P_AC_in × 100 at 100 %, 75 % and 50 % load. At 100 % load also compute P_heat = P_AC_in − P_DC_out.</w:t>
+            </w:r>
+          </w:p>
+        </w:tc>
+      </w:tr>
+      <w:tr>
+        <w:tc>
+          <w:tcPr>
+            <w:tcW w:type="dxa" w:w="3024"/>
           </w:tcPr>
           <w:p>
             <w:r>
@@ -5895,7 +5530,6 @@
         <w:tc>
           <w:tcPr>
             <w:tcW w:type="dxa" w:w="3024"/>
-            <w:shd w:val="clear" w:color="auto" w:fill="D9E1F2"/>
           </w:tcPr>
           <w:p>
             <w:r>
@@ -5921,7 +5555,6 @@
         <w:tc>
           <w:tcPr>
             <w:tcW w:type="dxa" w:w="3024"/>
-            <w:shd w:val="clear" w:color="auto" w:fill="D9E1F2"/>
           </w:tcPr>
           <w:p>
             <w:r>
@@ -5947,7 +5580,6 @@
         <w:tc>
           <w:tcPr>
             <w:tcW w:type="dxa" w:w="3024"/>
-            <w:shd w:val="clear" w:color="auto" w:fill="D9E1F2"/>
           </w:tcPr>
           <w:p>
             <w:r>
@@ -5971,7 +5603,6 @@
         <w:tc>
           <w:tcPr>
             <w:tcW w:type="dxa" w:w="3024"/>
-            <w:shd w:val="clear" w:color="auto" w:fill="D9E1F2"/>
           </w:tcPr>
           <w:p>
             <w:r>
@@ -6015,7 +5646,6 @@
         <w:tc>
           <w:tcPr>
             <w:tcW w:type="dxa" w:w="3024"/>
-            <w:shd w:val="clear" w:color="auto" w:fill="D9E1F2"/>
           </w:tcPr>
           <w:p>
             <w:r>
@@ -6041,7 +5671,6 @@
         <w:tc>
           <w:tcPr>
             <w:tcW w:type="dxa" w:w="3024"/>
-            <w:shd w:val="clear" w:color="auto" w:fill="D9E1F2"/>
           </w:tcPr>
           <w:p>
             <w:r>
@@ -6067,7 +5696,6 @@
         <w:tc>
           <w:tcPr>
             <w:tcW w:type="dxa" w:w="3024"/>
-            <w:shd w:val="clear" w:color="auto" w:fill="D9E1F2"/>
           </w:tcPr>
           <w:p>
             <w:r>
@@ -6093,7 +5721,6 @@
         <w:tc>
           <w:tcPr>
             <w:tcW w:type="dxa" w:w="3024"/>
-            <w:shd w:val="clear" w:color="auto" w:fill="D9E1F2"/>
           </w:tcPr>
           <w:p>
             <w:r>
@@ -6110,30 +5737,15 @@
           </w:tcPr>
           <w:p>
             <w:r>
-              <w:t>Install the C80 breaker in the AC supply circuit. Connect current clamps on all three phase conductors. Charger DC output connected to electronic load set to rated voltage (open circuit mode initially). Trigger oscilloscope on voltage rising edge of AC supply switch-on.</w:t>
-              <w:br/>
-              <w:t>1. With C80 breaker installed and AC supply disconnected from charger:</w:t>
-              <w:br/>
-              <w:t>2. Switch on AC supply (close C80 breaker). Record inrush waveform on all three phases.</w:t>
-              <w:br/>
-              <w:t>3. Measure peak inrush current I_peak [A] and duration t_inrush [ms].</w:t>
-              <w:br/>
-              <w:t>4. Verify C80 breaker did not trip.</w:t>
-              <w:br/>
-              <w:t>5. Repeat test 3 times with 5-minute cooling intervals. Record each result.</w:t>
-              <w:br/>
-              <w:t>6. If B32 breaker is available: install B32 and repeat steps 1–4 for recommended spec.</w:t>
-              <w:br/>
-              <w:t>7. Record all peak values and trip/no-trip outcome.</w:t>
-            </w:r>
-          </w:p>
-        </w:tc>
-      </w:tr>
-      <w:tr>
-        <w:tc>
-          <w:tcPr>
-            <w:tcW w:type="dxa" w:w="3024"/>
-            <w:shd w:val="clear" w:color="auto" w:fill="D9E1F2"/>
+              <w:t>Install the C80 breaker in the AC supply with current clamps on all three phases and the oscilloscope triggered on AC switch-on. Close the breaker from cold and record peak inrush I_peak and duration t_inrush, confirming no trip; repeat 3 times with 5-min cooling intervals. If a B32 breaker is available, repeat for the recommended spec. Record all peaks and trip/no-trip outcomes.</w:t>
+            </w:r>
+          </w:p>
+        </w:tc>
+      </w:tr>
+      <w:tr>
+        <w:tc>
+          <w:tcPr>
+            <w:tcW w:type="dxa" w:w="3024"/>
           </w:tcPr>
           <w:p>
             <w:r>
@@ -6161,7 +5773,6 @@
         <w:tc>
           <w:tcPr>
             <w:tcW w:type="dxa" w:w="3024"/>
-            <w:shd w:val="clear" w:color="auto" w:fill="D9E1F2"/>
           </w:tcPr>
           <w:p>
             <w:r>
@@ -6187,7 +5798,6 @@
         <w:tc>
           <w:tcPr>
             <w:tcW w:type="dxa" w:w="3024"/>
-            <w:shd w:val="clear" w:color="auto" w:fill="D9E1F2"/>
           </w:tcPr>
           <w:p>
             <w:r>
@@ -6213,7 +5823,6 @@
         <w:tc>
           <w:tcPr>
             <w:tcW w:type="dxa" w:w="3024"/>
-            <w:shd w:val="clear" w:color="auto" w:fill="D9E1F2"/>
           </w:tcPr>
           <w:p>
             <w:r>
@@ -6237,7 +5846,6 @@
         <w:tc>
           <w:tcPr>
             <w:tcW w:type="dxa" w:w="3024"/>
-            <w:shd w:val="clear" w:color="auto" w:fill="D9E1F2"/>
           </w:tcPr>
           <w:p>
             <w:r>
@@ -6281,7 +5889,6 @@
         <w:tc>
           <w:tcPr>
             <w:tcW w:type="dxa" w:w="3024"/>
-            <w:shd w:val="clear" w:color="auto" w:fill="D9E1F2"/>
           </w:tcPr>
           <w:p>
             <w:r>
@@ -6307,7 +5914,6 @@
         <w:tc>
           <w:tcPr>
             <w:tcW w:type="dxa" w:w="3024"/>
-            <w:shd w:val="clear" w:color="auto" w:fill="D9E1F2"/>
           </w:tcPr>
           <w:p>
             <w:r>
@@ -6333,7 +5939,6 @@
         <w:tc>
           <w:tcPr>
             <w:tcW w:type="dxa" w:w="3024"/>
-            <w:shd w:val="clear" w:color="auto" w:fill="D9E1F2"/>
           </w:tcPr>
           <w:p>
             <w:r>
@@ -6359,7 +5964,6 @@
         <w:tc>
           <w:tcPr>
             <w:tcW w:type="dxa" w:w="3024"/>
-            <w:shd w:val="clear" w:color="auto" w:fill="D9E1F2"/>
           </w:tcPr>
           <w:p>
             <w:r>
@@ -6376,28 +5980,15 @@
           </w:tcPr>
           <w:p>
             <w:r>
-              <w:t>Install thermocouples on: converter module heatsink, inlet coolant, outlet coolant, and ambient. Connect calibrated flow meter in the cooling loop.</w:t>
-              <w:br/>
-              <w:t>1. Start cooling pump and verify flow rate [L/min].</w:t>
-              <w:br/>
-              <w:t>2. Run charger at 100 % rated load for 60 minutes (same run as TS-6-01).</w:t>
-              <w:br/>
-              <w:t>3. Record every 10 minutes: heatsink temperature T_hs [°C], coolant inlet T_in [°C], coolant outlet T_out [°C], flow rate Q_cool [L/min], ambient T_amb [°C].</w:t>
-              <w:br/>
-              <w:t>4. At steady state (temperature change &lt; 1 °C over last 10 min), record all values.</w:t>
-              <w:br/>
-              <w:t>5. Calculate heat removal: P_removed = ṁ × c_p × (T_out − T_in) [W], where ṁ = Q_cool × ρ_water.</w:t>
-              <w:br/>
-              <w:t>6. Compare T_hs against converter module's maximum rated heatsink temperature.</w:t>
-            </w:r>
-          </w:p>
-        </w:tc>
-      </w:tr>
-      <w:tr>
-        <w:tc>
-          <w:tcPr>
-            <w:tcW w:type="dxa" w:w="3024"/>
-            <w:shd w:val="clear" w:color="auto" w:fill="D9E1F2"/>
+              <w:t>Fit thermocouples on the converter heatsink, coolant inlet/outlet and ambient, and a calibrated flow meter in the cooling loop. Run 100 % rated load for 60 min (same run as TS-6-01), recording T_hs, T_in, T_out, flow Q_cool and T_amb every 10 min. At steady state compute P_removed = ṁ × c_p × (T_out − T_in) with ṁ = Q_cool × ρ_water, and compare T_hs against the module's rated maximum heatsink temperature.</w:t>
+            </w:r>
+          </w:p>
+        </w:tc>
+      </w:tr>
+      <w:tr>
+        <w:tc>
+          <w:tcPr>
+            <w:tcW w:type="dxa" w:w="3024"/>
           </w:tcPr>
           <w:p>
             <w:r>
@@ -6425,7 +6016,6 @@
         <w:tc>
           <w:tcPr>
             <w:tcW w:type="dxa" w:w="3024"/>
-            <w:shd w:val="clear" w:color="auto" w:fill="D9E1F2"/>
           </w:tcPr>
           <w:p>
             <w:r>
@@ -6451,7 +6041,6 @@
         <w:tc>
           <w:tcPr>
             <w:tcW w:type="dxa" w:w="3024"/>
-            <w:shd w:val="clear" w:color="auto" w:fill="D9E1F2"/>
           </w:tcPr>
           <w:p>
             <w:r>
@@ -6477,7 +6066,6 @@
         <w:tc>
           <w:tcPr>
             <w:tcW w:type="dxa" w:w="3024"/>
-            <w:shd w:val="clear" w:color="auto" w:fill="D9E1F2"/>
           </w:tcPr>
           <w:p>
             <w:r>
@@ -6501,7 +6089,6 @@
         <w:tc>
           <w:tcPr>
             <w:tcW w:type="dxa" w:w="3024"/>
-            <w:shd w:val="clear" w:color="auto" w:fill="D9E1F2"/>
           </w:tcPr>
           <w:p>
             <w:r>
@@ -6545,7 +6132,6 @@
         <w:tc>
           <w:tcPr>
             <w:tcW w:type="dxa" w:w="3024"/>
-            <w:shd w:val="clear" w:color="auto" w:fill="D9E1F2"/>
           </w:tcPr>
           <w:p>
             <w:r>
@@ -6571,7 +6157,6 @@
         <w:tc>
           <w:tcPr>
             <w:tcW w:type="dxa" w:w="3024"/>
-            <w:shd w:val="clear" w:color="auto" w:fill="D9E1F2"/>
           </w:tcPr>
           <w:p>
             <w:r>
@@ -6597,7 +6182,6 @@
         <w:tc>
           <w:tcPr>
             <w:tcW w:type="dxa" w:w="3024"/>
-            <w:shd w:val="clear" w:color="auto" w:fill="D9E1F2"/>
           </w:tcPr>
           <w:p>
             <w:r>
@@ -6623,7 +6207,6 @@
         <w:tc>
           <w:tcPr>
             <w:tcW w:type="dxa" w:w="3024"/>
-            <w:shd w:val="clear" w:color="auto" w:fill="D9E1F2"/>
           </w:tcPr>
           <w:p>
             <w:r>
@@ -6640,30 +6223,15 @@
           </w:tcPr>
           <w:p>
             <w:r>
-              <w:t>Assemble prototype in standard operating configuration. Connect to rated AC supply and rated DC load. Perform tests in an accredited EMC lab or on-site pre-compliance.</w:t>
-              <w:br/>
-              <w:t>1. Conducted emissions test per IEC 61000-6-4 / CISPR 11 Class A.</w:t>
-              <w:br/>
-              <w:t>2. Radiated emissions test per IEC 61000-6-4 Class A.</w:t>
-              <w:br/>
-              <w:t>3. ESD immunity test per IEC 61000-4-2 (Level 3: 6 kV contact, 8 kV air).</w:t>
-              <w:br/>
-              <w:t>4. Electrical fast transient / burst per IEC 61000-4-4 (Level 3).</w:t>
-              <w:br/>
-              <w:t>5. Surge immunity per IEC 61000-4-5 (Level 3: 1 kV differential, 2 kV common mode).</w:t>
-              <w:br/>
-              <w:t>6. Record pass/fail for each sub-test.</w:t>
-              <w:br/>
-              <w:t>7. Log any failures with frequency, level and description.</w:t>
-            </w:r>
-          </w:p>
-        </w:tc>
-      </w:tr>
-      <w:tr>
-        <w:tc>
-          <w:tcPr>
-            <w:tcW w:type="dxa" w:w="3024"/>
-            <w:shd w:val="clear" w:color="auto" w:fill="D9E1F2"/>
+              <w:t>With the prototype in standard operating configuration on rated AC supply and DC load (accredited EMC lab or on-site pre-compliance), run: conducted and radiated emissions per IEC 61000-6-4 / CISPR 11 Class A; ESD per IEC 61000-4-2 (Level 3: 6 kV contact, 8 kV air); EFT/burst per IEC 61000-4-4 (Level 3); and surge per IEC 61000-4-5 (Level 3: 1 kV diff, 2 kV common). Record pass/fail and log any failure with frequency, level and description.</w:t>
+            </w:r>
+          </w:p>
+        </w:tc>
+      </w:tr>
+      <w:tr>
+        <w:tc>
+          <w:tcPr>
+            <w:tcW w:type="dxa" w:w="3024"/>
           </w:tcPr>
           <w:p>
             <w:r>
@@ -6691,7 +6259,6 @@
         <w:tc>
           <w:tcPr>
             <w:tcW w:type="dxa" w:w="3024"/>
-            <w:shd w:val="clear" w:color="auto" w:fill="D9E1F2"/>
           </w:tcPr>
           <w:p>
             <w:r>
@@ -6717,7 +6284,6 @@
         <w:tc>
           <w:tcPr>
             <w:tcW w:type="dxa" w:w="3024"/>
-            <w:shd w:val="clear" w:color="auto" w:fill="D9E1F2"/>
           </w:tcPr>
           <w:p>
             <w:r>
@@ -6743,7 +6309,6 @@
         <w:tc>
           <w:tcPr>
             <w:tcW w:type="dxa" w:w="3024"/>
-            <w:shd w:val="clear" w:color="auto" w:fill="D9E1F2"/>
           </w:tcPr>
           <w:p>
             <w:r>
@@ -6767,7 +6332,6 @@
         <w:tc>
           <w:tcPr>
             <w:tcW w:type="dxa" w:w="3024"/>
-            <w:shd w:val="clear" w:color="auto" w:fill="D9E1F2"/>
           </w:tcPr>
           <w:p>
             <w:r>
@@ -6811,7 +6375,6 @@
         <w:tc>
           <w:tcPr>
             <w:tcW w:type="dxa" w:w="3024"/>
-            <w:shd w:val="clear" w:color="auto" w:fill="D9E1F2"/>
           </w:tcPr>
           <w:p>
             <w:r>
@@ -6837,7 +6400,6 @@
         <w:tc>
           <w:tcPr>
             <w:tcW w:type="dxa" w:w="3024"/>
-            <w:shd w:val="clear" w:color="auto" w:fill="D9E1F2"/>
           </w:tcPr>
           <w:p>
             <w:r>
@@ -6863,7 +6425,6 @@
         <w:tc>
           <w:tcPr>
             <w:tcW w:type="dxa" w:w="3024"/>
-            <w:shd w:val="clear" w:color="auto" w:fill="D9E1F2"/>
           </w:tcPr>
           <w:p>
             <w:r>
@@ -6889,7 +6450,6 @@
         <w:tc>
           <w:tcPr>
             <w:tcW w:type="dxa" w:w="3024"/>
-            <w:shd w:val="clear" w:color="auto" w:fill="D9E1F2"/>
           </w:tcPr>
           <w:p>
             <w:r>
@@ -6906,36 +6466,15 @@
           </w:tcPr>
           <w:p>
             <w:r>
-              <w:t>Mount the charger (or representative assembly) on the vibration test fixture. If no shake table is available, perform a structured visual and documentation review of the converter module vibration rating.</w:t>
-              <w:br/>
-              <w:t>1. Option A – Physical vibration test:</w:t>
-              <w:br/>
-              <w:t>2.   Set vibration profile per IEC 60068-2-64 (road transport: 5–100 Hz, 0.1 g²/Hz).</w:t>
-              <w:br/>
-              <w:t>3.   Run for 1 hour per axis (X, Y, Z).</w:t>
-              <w:br/>
-              <w:t>4.   After test: inspect for loose fasteners, connector damage, coolant leaks.</w:t>
-              <w:br/>
-              <w:t>5. Option B – Documentation review (if no shake table):</w:t>
-              <w:br/>
-              <w:t>6.   Verify converter module datasheet vibration rating meets IEC 60068-2-6 / -64 road transport class.</w:t>
-              <w:br/>
-              <w:t>7.   Verify all fasteners are torqued to specification.</w:t>
-              <w:br/>
-              <w:t>8.   Verify all connectors are locked/latch-secured.</w:t>
-              <w:br/>
-              <w:t>9.   Verify cooling hoses have strain-relief clamps.</w:t>
-              <w:br/>
-              <w:t>10. Record outcome of physical test or documentation review.</w:t>
-            </w:r>
-          </w:p>
-        </w:tc>
-      </w:tr>
-      <w:tr>
-        <w:tc>
-          <w:tcPr>
-            <w:tcW w:type="dxa" w:w="3024"/>
-            <w:shd w:val="clear" w:color="auto" w:fill="D9E1F2"/>
+              <w:t>Option A (shake table): mount the assembly and run IEC 60068-2-64 road-transport profile (5–100 Hz, 0.1 g²/Hz) for 1 hour per axis (X, Y, Z), then inspect for loose fasteners, connector damage and coolant leaks. Option B (no shake table): verify the module datasheet vibration rating meets IEC 60068-2-6/-64 road-transport class and that all fasteners are torqued to spec, connectors latch-secured and cooling hoses strain-relieved. Record the outcome.</w:t>
+            </w:r>
+          </w:p>
+        </w:tc>
+      </w:tr>
+      <w:tr>
+        <w:tc>
+          <w:tcPr>
+            <w:tcW w:type="dxa" w:w="3024"/>
           </w:tcPr>
           <w:p>
             <w:r>
@@ -6963,7 +6502,6 @@
         <w:tc>
           <w:tcPr>
             <w:tcW w:type="dxa" w:w="3024"/>
-            <w:shd w:val="clear" w:color="auto" w:fill="D9E1F2"/>
           </w:tcPr>
           <w:p>
             <w:r>
@@ -6989,7 +6527,6 @@
         <w:tc>
           <w:tcPr>
             <w:tcW w:type="dxa" w:w="3024"/>
-            <w:shd w:val="clear" w:color="auto" w:fill="D9E1F2"/>
           </w:tcPr>
           <w:p>
             <w:r>
@@ -7015,7 +6552,6 @@
         <w:tc>
           <w:tcPr>
             <w:tcW w:type="dxa" w:w="3024"/>
-            <w:shd w:val="clear" w:color="auto" w:fill="D9E1F2"/>
           </w:tcPr>
           <w:p>
             <w:r>
@@ -7039,7 +6575,6 @@
         <w:tc>
           <w:tcPr>
             <w:tcW w:type="dxa" w:w="3024"/>
-            <w:shd w:val="clear" w:color="auto" w:fill="D9E1F2"/>
           </w:tcPr>
           <w:p>
             <w:r>
@@ -7083,7 +6618,6 @@
         <w:tc>
           <w:tcPr>
             <w:tcW w:type="dxa" w:w="3024"/>
-            <w:shd w:val="clear" w:color="auto" w:fill="D9E1F2"/>
           </w:tcPr>
           <w:p>
             <w:r>
@@ -7109,7 +6643,6 @@
         <w:tc>
           <w:tcPr>
             <w:tcW w:type="dxa" w:w="3024"/>
-            <w:shd w:val="clear" w:color="auto" w:fill="D9E1F2"/>
           </w:tcPr>
           <w:p>
             <w:r>
@@ -7135,7 +6668,6 @@
         <w:tc>
           <w:tcPr>
             <w:tcW w:type="dxa" w:w="3024"/>
-            <w:shd w:val="clear" w:color="auto" w:fill="D9E1F2"/>
           </w:tcPr>
           <w:p>
             <w:r>
@@ -7161,7 +6693,6 @@
         <w:tc>
           <w:tcPr>
             <w:tcW w:type="dxa" w:w="3024"/>
-            <w:shd w:val="clear" w:color="auto" w:fill="D9E1F2"/>
           </w:tcPr>
           <w:p>
             <w:r>
@@ -7178,28 +6709,15 @@
           </w:tcPr>
           <w:p>
             <w:r>
-              <w:t>Charger powered up with DC output disconnected from battery. Measure leakage current from DC+ and DC− rails to chassis/earth.</w:t>
-              <w:br/>
-              <w:t>1. Power up the charger (AC input connected, DC output open or connected to load at rated voltage).</w:t>
-              <w:br/>
-              <w:t>2. Measure DC leakage current from DC+ bus to chassis ground [mA].</w:t>
-              <w:br/>
-              <w:t>3. Measure DC leakage current from DC− bus to chassis ground [mA].</w:t>
-              <w:br/>
-              <w:t>4. Obtain the e-PU10 precharge circuit maximum current rating from the e-PU10 specification.</w:t>
-              <w:br/>
-              <w:t>5. Compare measured leakage against precharge circuit limit.</w:t>
-              <w:br/>
-              <w:t>6. Record result.</w:t>
-            </w:r>
-          </w:p>
-        </w:tc>
-      </w:tr>
-      <w:tr>
-        <w:tc>
-          <w:tcPr>
-            <w:tcW w:type="dxa" w:w="3024"/>
-            <w:shd w:val="clear" w:color="auto" w:fill="D9E1F2"/>
+              <w:t>With the charger powered (AC connected, DC output open or at rated voltage), measure DC leakage current from the DC+ and DC− buses to chassis ground. Obtain the e-PU10 precharge circuit maximum current rating and compare the measured leakage against it.</w:t>
+            </w:r>
+          </w:p>
+        </w:tc>
+      </w:tr>
+      <w:tr>
+        <w:tc>
+          <w:tcPr>
+            <w:tcW w:type="dxa" w:w="3024"/>
           </w:tcPr>
           <w:p>
             <w:r>
@@ -7227,7 +6745,6 @@
         <w:tc>
           <w:tcPr>
             <w:tcW w:type="dxa" w:w="3024"/>
-            <w:shd w:val="clear" w:color="auto" w:fill="D9E1F2"/>
           </w:tcPr>
           <w:p>
             <w:r>
@@ -7253,7 +6770,6 @@
         <w:tc>
           <w:tcPr>
             <w:tcW w:type="dxa" w:w="3024"/>
-            <w:shd w:val="clear" w:color="auto" w:fill="D9E1F2"/>
           </w:tcPr>
           <w:p>
             <w:r>
@@ -7279,7 +6795,6 @@
         <w:tc>
           <w:tcPr>
             <w:tcW w:type="dxa" w:w="3024"/>
-            <w:shd w:val="clear" w:color="auto" w:fill="D9E1F2"/>
           </w:tcPr>
           <w:p>
             <w:r>
@@ -7303,7 +6818,6 @@
         <w:tc>
           <w:tcPr>
             <w:tcW w:type="dxa" w:w="3024"/>
-            <w:shd w:val="clear" w:color="auto" w:fill="D9E1F2"/>
           </w:tcPr>
           <w:p>
             <w:r>
@@ -7347,7 +6861,6 @@
         <w:tc>
           <w:tcPr>
             <w:tcW w:type="dxa" w:w="3024"/>
-            <w:shd w:val="clear" w:color="auto" w:fill="D9E1F2"/>
           </w:tcPr>
           <w:p>
             <w:r>
@@ -7373,7 +6886,6 @@
         <w:tc>
           <w:tcPr>
             <w:tcW w:type="dxa" w:w="3024"/>
-            <w:shd w:val="clear" w:color="auto" w:fill="D9E1F2"/>
           </w:tcPr>
           <w:p>
             <w:r>
@@ -7399,7 +6911,6 @@
         <w:tc>
           <w:tcPr>
             <w:tcW w:type="dxa" w:w="3024"/>
-            <w:shd w:val="clear" w:color="auto" w:fill="D9E1F2"/>
           </w:tcPr>
           <w:p>
             <w:r>
@@ -7425,7 +6936,6 @@
         <w:tc>
           <w:tcPr>
             <w:tcW w:type="dxa" w:w="3024"/>
-            <w:shd w:val="clear" w:color="auto" w:fill="D9E1F2"/>
           </w:tcPr>
           <w:p>
             <w:r>
@@ -7442,30 +6952,15 @@
           </w:tcPr>
           <w:p>
             <w:r>
-              <w:t>Connect charger to rated AC supply and DC electronic load. Program automated cycling: 30 min full load → 5 min 50 % load → repeat. Log all faults, shutdowns and restart events automatically.</w:t>
-              <w:br/>
-              <w:t>1. Start automated endurance cycle. Record start time.</w:t>
-              <w:br/>
-              <w:t>2. Run continuously for 72 hours (minimum).</w:t>
-              <w:br/>
-              <w:t>3. Log all fault events: timestamp, fault code, duration of downtime.</w:t>
-              <w:br/>
-              <w:t>4. After 72 hours, stop the test and record stop time.</w:t>
-              <w:br/>
-              <w:t>5. Calculate total fault downtime [min].</w:t>
-              <w:br/>
-              <w:t>6. Calculate uptime %: (72 × 60 − Σ downtime_min) / (72 × 60) × 100.</w:t>
-              <w:br/>
-              <w:t>7. Review fault log for recurring patterns.</w:t>
-            </w:r>
-          </w:p>
-        </w:tc>
-      </w:tr>
-      <w:tr>
-        <w:tc>
-          <w:tcPr>
-            <w:tcW w:type="dxa" w:w="3024"/>
-            <w:shd w:val="clear" w:color="auto" w:fill="D9E1F2"/>
+              <w:t>Connect the charger to rated AC supply and DC electronic load and run an automated cycle (30 min full load → 5 min 50 % load, repeated) continuously for ≥ 72 hours, auto-logging every fault (timestamp, code, downtime). Afterwards compute total downtime and uptime % = (72×60 − Σ downtime)/(72×60) × 100 and review the log for recurring faults.</w:t>
+            </w:r>
+          </w:p>
+        </w:tc>
+      </w:tr>
+      <w:tr>
+        <w:tc>
+          <w:tcPr>
+            <w:tcW w:type="dxa" w:w="3024"/>
           </w:tcPr>
           <w:p>
             <w:r>
@@ -7493,7 +6988,6 @@
         <w:tc>
           <w:tcPr>
             <w:tcW w:type="dxa" w:w="3024"/>
-            <w:shd w:val="clear" w:color="auto" w:fill="D9E1F2"/>
           </w:tcPr>
           <w:p>
             <w:r>
@@ -7519,7 +7013,6 @@
         <w:tc>
           <w:tcPr>
             <w:tcW w:type="dxa" w:w="3024"/>
-            <w:shd w:val="clear" w:color="auto" w:fill="D9E1F2"/>
           </w:tcPr>
           <w:p>
             <w:r>
@@ -7545,7 +7038,6 @@
         <w:tc>
           <w:tcPr>
             <w:tcW w:type="dxa" w:w="3024"/>
-            <w:shd w:val="clear" w:color="auto" w:fill="D9E1F2"/>
           </w:tcPr>
           <w:p>
             <w:r>
@@ -7569,7 +7061,6 @@
         <w:tc>
           <w:tcPr>
             <w:tcW w:type="dxa" w:w="3024"/>
-            <w:shd w:val="clear" w:color="auto" w:fill="D9E1F2"/>
           </w:tcPr>
           <w:p>
             <w:r>
@@ -7621,7 +7112,6 @@
         <w:tc>
           <w:tcPr>
             <w:tcW w:type="dxa" w:w="3024"/>
-            <w:shd w:val="clear" w:color="auto" w:fill="D9E1F2"/>
           </w:tcPr>
           <w:p>
             <w:r>
@@ -7647,7 +7137,6 @@
         <w:tc>
           <w:tcPr>
             <w:tcW w:type="dxa" w:w="3024"/>
-            <w:shd w:val="clear" w:color="auto" w:fill="D9E1F2"/>
           </w:tcPr>
           <w:p>
             <w:r>
@@ -7673,7 +7162,6 @@
         <w:tc>
           <w:tcPr>
             <w:tcW w:type="dxa" w:w="3024"/>
-            <w:shd w:val="clear" w:color="auto" w:fill="D9E1F2"/>
           </w:tcPr>
           <w:p>
             <w:r>
@@ -7699,7 +7187,6 @@
         <w:tc>
           <w:tcPr>
             <w:tcW w:type="dxa" w:w="3024"/>
-            <w:shd w:val="clear" w:color="auto" w:fill="D9E1F2"/>
           </w:tcPr>
           <w:p>
             <w:r>
@@ -7716,28 +7203,15 @@
           </w:tcPr>
           <w:p>
             <w:r>
-              <w:t>Compare each technical parameter in the datasheet against the corresponding TRL 6 measured result.</w:t>
-              <w:br/>
-              <w:t>1. Obtain draft technical datasheet.</w:t>
-              <w:br/>
-              <w:t>2. For each stated parameter, identify the corresponding TRL 6 test sheet result.</w:t>
-              <w:br/>
-              <w:t>3. Check: (a) Rated power [kW]; (b) Efficiency [%]; (c) DC voltage range [V]; (d) Weight [kg]; (e) Dimensions [mm]; (f) Cooling specifications; (g) Communication protocol.</w:t>
-              <w:br/>
-              <w:t>4. Verify that each datasheet figure is ≤ (for max limits) or ≥ (for min limits) the measured value plus tolerance.</w:t>
-              <w:br/>
-              <w:t>5. Mark each parameter as Consistent / Inconsistent.</w:t>
-              <w:br/>
-              <w:t>6. Correct any inconsistencies in the datasheet.</w:t>
-            </w:r>
-          </w:p>
-        </w:tc>
-      </w:tr>
-      <w:tr>
-        <w:tc>
-          <w:tcPr>
-            <w:tcW w:type="dxa" w:w="3024"/>
-            <w:shd w:val="clear" w:color="auto" w:fill="D9E1F2"/>
+              <w:t>For each of the 7 key datasheet parameters — rated power, efficiency, DC voltage range, weight, dimensions, cooling specs and communication protocol — compare the stated figure against the corresponding TRL 6 result (≤ for max limits, ≥ for min limits, plus tolerance), mark Consistent/Inconsistent and correct any inconsistency.</w:t>
+            </w:r>
+          </w:p>
+        </w:tc>
+      </w:tr>
+      <w:tr>
+        <w:tc>
+          <w:tcPr>
+            <w:tcW w:type="dxa" w:w="3024"/>
           </w:tcPr>
           <w:p>
             <w:r>
@@ -7765,7 +7239,6 @@
         <w:tc>
           <w:tcPr>
             <w:tcW w:type="dxa" w:w="3024"/>
-            <w:shd w:val="clear" w:color="auto" w:fill="D9E1F2"/>
           </w:tcPr>
           <w:p>
             <w:r>
@@ -7791,7 +7264,6 @@
         <w:tc>
           <w:tcPr>
             <w:tcW w:type="dxa" w:w="3024"/>
-            <w:shd w:val="clear" w:color="auto" w:fill="D9E1F2"/>
           </w:tcPr>
           <w:p>
             <w:r>
@@ -7817,7 +7289,6 @@
         <w:tc>
           <w:tcPr>
             <w:tcW w:type="dxa" w:w="3024"/>
-            <w:shd w:val="clear" w:color="auto" w:fill="D9E1F2"/>
           </w:tcPr>
           <w:p>
             <w:r>
@@ -7841,7 +7312,6 @@
         <w:tc>
           <w:tcPr>
             <w:tcW w:type="dxa" w:w="3024"/>
-            <w:shd w:val="clear" w:color="auto" w:fill="D9E1F2"/>
           </w:tcPr>
           <w:p>
             <w:r>
@@ -7885,7 +7355,6 @@
         <w:tc>
           <w:tcPr>
             <w:tcW w:type="dxa" w:w="3024"/>
-            <w:shd w:val="clear" w:color="auto" w:fill="D9E1F2"/>
           </w:tcPr>
           <w:p>
             <w:r>
@@ -7911,7 +7380,6 @@
         <w:tc>
           <w:tcPr>
             <w:tcW w:type="dxa" w:w="3024"/>
-            <w:shd w:val="clear" w:color="auto" w:fill="D9E1F2"/>
           </w:tcPr>
           <w:p>
             <w:r>
@@ -7937,7 +7405,6 @@
         <w:tc>
           <w:tcPr>
             <w:tcW w:type="dxa" w:w="3024"/>
-            <w:shd w:val="clear" w:color="auto" w:fill="D9E1F2"/>
           </w:tcPr>
           <w:p>
             <w:r>
@@ -7963,7 +7430,6 @@
         <w:tc>
           <w:tcPr>
             <w:tcW w:type="dxa" w:w="3024"/>
-            <w:shd w:val="clear" w:color="auto" w:fill="D9E1F2"/>
           </w:tcPr>
           <w:p>
             <w:r>
@@ -7980,28 +7446,15 @@
           </w:tcPr>
           <w:p>
             <w:r>
-              <w:t>Present the final one-pager to project lead (L. Rietkerk) and a sales representative.</w:t>
-              <w:br/>
-              <w:t>1. Distribute draft sales one-pager to project lead and sales representative.</w:t>
-              <w:br/>
-              <w:t>2. Review document for: (a) accuracy of technical specs; (b) USPs clearly stated; (c) compliance claims supported by certificates.</w:t>
-              <w:br/>
-              <w:t>3. Incorporate any review comments.</w:t>
-              <w:br/>
-              <w:t>4. Obtain signed approval from project lead.</w:t>
-              <w:br/>
-              <w:t>5. Obtain signed approval from sales representative.</w:t>
-              <w:br/>
-              <w:t>6. File approved document in project document management system.</w:t>
-            </w:r>
-          </w:p>
-        </w:tc>
-      </w:tr>
-      <w:tr>
-        <w:tc>
-          <w:tcPr>
-            <w:tcW w:type="dxa" w:w="3024"/>
-            <w:shd w:val="clear" w:color="auto" w:fill="D9E1F2"/>
+              <w:t>Present the final one-pager to project lead (L. Rietkerk) and a sales representative, reviewing accuracy of technical specs, clearly stated USPs and compliance claims supported by certificates. Incorporate comments, obtain both signed approvals and file the document in the DMS.</w:t>
+            </w:r>
+          </w:p>
+        </w:tc>
+      </w:tr>
+      <w:tr>
+        <w:tc>
+          <w:tcPr>
+            <w:tcW w:type="dxa" w:w="3024"/>
           </w:tcPr>
           <w:p>
             <w:r>
@@ -8029,7 +7482,6 @@
         <w:tc>
           <w:tcPr>
             <w:tcW w:type="dxa" w:w="3024"/>
-            <w:shd w:val="clear" w:color="auto" w:fill="D9E1F2"/>
           </w:tcPr>
           <w:p>
             <w:r>
@@ -8055,7 +7507,6 @@
         <w:tc>
           <w:tcPr>
             <w:tcW w:type="dxa" w:w="3024"/>
-            <w:shd w:val="clear" w:color="auto" w:fill="D9E1F2"/>
           </w:tcPr>
           <w:p>
             <w:r>
@@ -8081,7 +7532,6 @@
         <w:tc>
           <w:tcPr>
             <w:tcW w:type="dxa" w:w="3024"/>
-            <w:shd w:val="clear" w:color="auto" w:fill="D9E1F2"/>
           </w:tcPr>
           <w:p>
             <w:r>
@@ -8105,7 +7555,6 @@
         <w:tc>
           <w:tcPr>
             <w:tcW w:type="dxa" w:w="3024"/>
-            <w:shd w:val="clear" w:color="auto" w:fill="D9E1F2"/>
           </w:tcPr>
           <w:p>
             <w:r>
@@ -8157,7 +7606,6 @@
         <w:tc>
           <w:tcPr>
             <w:tcW w:type="dxa" w:w="3024"/>
-            <w:shd w:val="clear" w:color="auto" w:fill="D9E1F2"/>
           </w:tcPr>
           <w:p>
             <w:r>
@@ -8183,7 +7631,6 @@
         <w:tc>
           <w:tcPr>
             <w:tcW w:type="dxa" w:w="3024"/>
-            <w:shd w:val="clear" w:color="auto" w:fill="D9E1F2"/>
           </w:tcPr>
           <w:p>
             <w:r>
@@ -8209,7 +7656,6 @@
         <w:tc>
           <w:tcPr>
             <w:tcW w:type="dxa" w:w="3024"/>
-            <w:shd w:val="clear" w:color="auto" w:fill="D9E1F2"/>
           </w:tcPr>
           <w:p>
             <w:r>
@@ -8235,7 +7681,6 @@
         <w:tc>
           <w:tcPr>
             <w:tcW w:type="dxa" w:w="3024"/>
-            <w:shd w:val="clear" w:color="auto" w:fill="D9E1F2"/>
           </w:tcPr>
           <w:p>
             <w:r>
@@ -8252,44 +7697,15 @@
           </w:tcPr>
           <w:p>
             <w:r>
-              <w:t>Retrieve the complete document package from the project folder.</w:t>
-              <w:br/>
-              <w:t>1. Check availability and approval status of each required document:</w:t>
-              <w:br/>
-              <w:t>2.   a. Project plan (final version, signed)</w:t>
-              <w:br/>
-              <w:t>3.   b. This Measurement Plan (all test sheets completed and signed)</w:t>
-              <w:br/>
-              <w:t>4.   c. Detailed electrical drawings (released revision)</w:t>
-              <w:br/>
-              <w:t>5.   d. Detailed mechanical drawings (released revision)</w:t>
-              <w:br/>
-              <w:t>6.   e. BOM (final, with part numbers and supplier references)</w:t>
-              <w:br/>
-              <w:t>7.   f. Software documentation (architecture, register map, version)</w:t>
-              <w:br/>
-              <w:t>8.   g. CE Declaration of Conformity</w:t>
-              <w:br/>
-              <w:t>9.   h. IEC 61439 design verification record</w:t>
-              <w:br/>
-              <w:t>10.   i. NEN 1010 compliance record</w:t>
-              <w:br/>
-              <w:t>11.   j. User manual / operating instructions</w:t>
-              <w:br/>
-              <w:t>12.   k. Assembly / build book</w:t>
-              <w:br/>
-              <w:t>13. Mark each document as Complete / Incomplete / Missing.</w:t>
-              <w:br/>
-              <w:t>14. Raise non-conformances for any incomplete or missing items.</w:t>
-            </w:r>
-          </w:p>
-        </w:tc>
-      </w:tr>
-      <w:tr>
-        <w:tc>
-          <w:tcPr>
-            <w:tcW w:type="dxa" w:w="3024"/>
-            <w:shd w:val="clear" w:color="auto" w:fill="D9E1F2"/>
+              <w:t>Check the availability and approval status of the 11 required documents — signed final project plan; this Measurement Plan (all sheets completed and signed); released electrical and mechanical drawings; final BOM (part numbers and suppliers); software docs (architecture, register map, version); CE Declaration of Conformity; IEC 61439 design verification record; NEN 1010 compliance record; user manual; and assembly/build book. Mark each Complete/Incomplete/Missing and raise non-conformances for gaps.</w:t>
+            </w:r>
+          </w:p>
+        </w:tc>
+      </w:tr>
+      <w:tr>
+        <w:tc>
+          <w:tcPr>
+            <w:tcW w:type="dxa" w:w="3024"/>
           </w:tcPr>
           <w:p>
             <w:r>
@@ -8317,7 +7733,6 @@
         <w:tc>
           <w:tcPr>
             <w:tcW w:type="dxa" w:w="3024"/>
-            <w:shd w:val="clear" w:color="auto" w:fill="D9E1F2"/>
           </w:tcPr>
           <w:p>
             <w:r>
@@ -8343,7 +7758,6 @@
         <w:tc>
           <w:tcPr>
             <w:tcW w:type="dxa" w:w="3024"/>
-            <w:shd w:val="clear" w:color="auto" w:fill="D9E1F2"/>
           </w:tcPr>
           <w:p>
             <w:r>
@@ -8369,7 +7783,6 @@
         <w:tc>
           <w:tcPr>
             <w:tcW w:type="dxa" w:w="3024"/>
-            <w:shd w:val="clear" w:color="auto" w:fill="D9E1F2"/>
           </w:tcPr>
           <w:p>
             <w:r>
@@ -8393,7 +7806,6 @@
         <w:tc>
           <w:tcPr>
             <w:tcW w:type="dxa" w:w="3024"/>
-            <w:shd w:val="clear" w:color="auto" w:fill="D9E1F2"/>
           </w:tcPr>
           <w:p>
             <w:r>
@@ -8437,7 +7849,6 @@
         <w:tc>
           <w:tcPr>
             <w:tcW w:type="dxa" w:w="3024"/>
-            <w:shd w:val="clear" w:color="auto" w:fill="D9E1F2"/>
           </w:tcPr>
           <w:p>
             <w:r>
@@ -8463,7 +7874,6 @@
         <w:tc>
           <w:tcPr>
             <w:tcW w:type="dxa" w:w="3024"/>
-            <w:shd w:val="clear" w:color="auto" w:fill="D9E1F2"/>
           </w:tcPr>
           <w:p>
             <w:r>
@@ -8489,7 +7899,6 @@
         <w:tc>
           <w:tcPr>
             <w:tcW w:type="dxa" w:w="3024"/>
-            <w:shd w:val="clear" w:color="auto" w:fill="D9E1F2"/>
           </w:tcPr>
           <w:p>
             <w:r>
@@ -8515,7 +7924,6 @@
         <w:tc>
           <w:tcPr>
             <w:tcW w:type="dxa" w:w="3024"/>
-            <w:shd w:val="clear" w:color="auto" w:fill="D9E1F2"/>
           </w:tcPr>
           <w:p>
             <w:r>
@@ -8532,28 +7940,15 @@
           </w:tcPr>
           <w:p>
             <w:r>
-              <w:t>Review the complete design package against the series-readiness checklist.</w:t>
-              <w:br/>
-              <w:t>1. Verify all components in the BOM are commercially available with lead time &lt; 8 weeks.</w:t>
-              <w:br/>
-              <w:t>2. Verify the assembly process can be performed by a trained technician using the build book alone (no expert assistance required).</w:t>
-              <w:br/>
-              <w:t>3. Verify all software can be flashed/configured from the build book procedure.</w:t>
-              <w:br/>
-              <w:t>4. Verify no prototype-specific workarounds remain in the design or build procedure.</w:t>
-              <w:br/>
-              <w:t>5. Verify quality control steps are defined for production.</w:t>
-              <w:br/>
-              <w:t>6. Record any open items.</w:t>
-            </w:r>
-          </w:p>
-        </w:tc>
-      </w:tr>
-      <w:tr>
-        <w:tc>
-          <w:tcPr>
-            <w:tcW w:type="dxa" w:w="3024"/>
-            <w:shd w:val="clear" w:color="auto" w:fill="D9E1F2"/>
+              <w:t>Review the design package against the 5 series-readiness criteria: all BOM components commercially available with lead time &lt; 8 weeks; assembly achievable by a trained technician from the build book alone; software flashable/configurable from the build book; no prototype-specific workarounds remaining; and production quality-control steps defined. Record any open items.</w:t>
+            </w:r>
+          </w:p>
+        </w:tc>
+      </w:tr>
+      <w:tr>
+        <w:tc>
+          <w:tcPr>
+            <w:tcW w:type="dxa" w:w="3024"/>
           </w:tcPr>
           <w:p>
             <w:r>
@@ -8581,7 +7976,6 @@
         <w:tc>
           <w:tcPr>
             <w:tcW w:type="dxa" w:w="3024"/>
-            <w:shd w:val="clear" w:color="auto" w:fill="D9E1F2"/>
           </w:tcPr>
           <w:p>
             <w:r>
@@ -8607,7 +8001,6 @@
         <w:tc>
           <w:tcPr>
             <w:tcW w:type="dxa" w:w="3024"/>
-            <w:shd w:val="clear" w:color="auto" w:fill="D9E1F2"/>
           </w:tcPr>
           <w:p>
             <w:r>
@@ -8633,7 +8026,6 @@
         <w:tc>
           <w:tcPr>
             <w:tcW w:type="dxa" w:w="3024"/>
-            <w:shd w:val="clear" w:color="auto" w:fill="D9E1F2"/>
           </w:tcPr>
           <w:p>
             <w:r>
@@ -8657,7 +8049,6 @@
         <w:tc>
           <w:tcPr>
             <w:tcW w:type="dxa" w:w="3024"/>
-            <w:shd w:val="clear" w:color="auto" w:fill="D9E1F2"/>
           </w:tcPr>
           <w:p>
             <w:r>
@@ -8701,7 +8092,6 @@
         <w:tc>
           <w:tcPr>
             <w:tcW w:type="dxa" w:w="3024"/>
-            <w:shd w:val="clear" w:color="auto" w:fill="D9E1F2"/>
           </w:tcPr>
           <w:p>
             <w:r>
@@ -8727,7 +8117,6 @@
         <w:tc>
           <w:tcPr>
             <w:tcW w:type="dxa" w:w="3024"/>
-            <w:shd w:val="clear" w:color="auto" w:fill="D9E1F2"/>
           </w:tcPr>
           <w:p>
             <w:r>
@@ -8753,7 +8142,6 @@
         <w:tc>
           <w:tcPr>
             <w:tcW w:type="dxa" w:w="3024"/>
-            <w:shd w:val="clear" w:color="auto" w:fill="D9E1F2"/>
           </w:tcPr>
           <w:p>
             <w:r>
@@ -8779,7 +8167,6 @@
         <w:tc>
           <w:tcPr>
             <w:tcW w:type="dxa" w:w="3024"/>
-            <w:shd w:val="clear" w:color="auto" w:fill="D9E1F2"/>
           </w:tcPr>
           <w:p>
             <w:r>
@@ -8796,38 +8183,15 @@
           </w:tcPr>
           <w:p>
             <w:r>
-              <w:t>Enter product into the sales matrix with the project lead and sales stakeholder present.</w:t>
-              <w:br/>
-              <w:t>1. Enter product in sales matrix with the following information:</w:t>
-              <w:br/>
-              <w:t>2.   a. Product name: 400A AC/DC Charger for e-PU10</w:t>
-              <w:br/>
-              <w:t>3.   b. Rated power [kW]</w:t>
-              <w:br/>
-              <w:t>4.   c. DC voltage range [V]</w:t>
-              <w:br/>
-              <w:t>5.   d. Efficiency [%]</w:t>
-              <w:br/>
-              <w:t>6.   e. Communication protocol</w:t>
-              <w:br/>
-              <w:t>7.   f. Compliance standards (IEC 61439, NEN 1010, CE)</w:t>
-              <w:br/>
-              <w:t>8.   g. Lead time and price indication</w:t>
-              <w:br/>
-              <w:t>9. Obtain sign-off from project lead (L. Rietkerk).</w:t>
-              <w:br/>
-              <w:t>10. Obtain sign-off from sales representative.</w:t>
-              <w:br/>
-              <w:t>11. Archive the signed transfer document.</w:t>
-            </w:r>
-          </w:p>
-        </w:tc>
-      </w:tr>
-      <w:tr>
-        <w:tc>
-          <w:tcPr>
-            <w:tcW w:type="dxa" w:w="3024"/>
-            <w:shd w:val="clear" w:color="auto" w:fill="D9E1F2"/>
+              <w:t>Enter the product in the sales matrix with all 7 fields — product name (400A AC/DC Charger for e-PU10), rated power, DC voltage range, efficiency, communication protocol, compliance standards (IEC 61439, NEN 1010, CE) and lead time/price indication — then obtain sign-off from project lead (L. Rietkerk) and the sales representative and archive the signed transfer document.</w:t>
+            </w:r>
+          </w:p>
+        </w:tc>
+      </w:tr>
+      <w:tr>
+        <w:tc>
+          <w:tcPr>
+            <w:tcW w:type="dxa" w:w="3024"/>
           </w:tcPr>
           <w:p>
             <w:r>
@@ -8855,7 +8219,6 @@
         <w:tc>
           <w:tcPr>
             <w:tcW w:type="dxa" w:w="3024"/>
-            <w:shd w:val="clear" w:color="auto" w:fill="D9E1F2"/>
           </w:tcPr>
           <w:p>
             <w:r>
@@ -8881,7 +8244,6 @@
         <w:tc>
           <w:tcPr>
             <w:tcW w:type="dxa" w:w="3024"/>
-            <w:shd w:val="clear" w:color="auto" w:fill="D9E1F2"/>
           </w:tcPr>
           <w:p>
             <w:r>
@@ -8907,7 +8269,6 @@
         <w:tc>
           <w:tcPr>
             <w:tcW w:type="dxa" w:w="3024"/>
-            <w:shd w:val="clear" w:color="auto" w:fill="D9E1F2"/>
           </w:tcPr>
           <w:p>
             <w:r>
@@ -8931,7 +8292,6 @@
         <w:tc>
           <w:tcPr>
             <w:tcW w:type="dxa" w:w="3024"/>
-            <w:shd w:val="clear" w:color="auto" w:fill="D9E1F2"/>
           </w:tcPr>
           <w:p>
             <w:r>

</xml_diff>